<commit_message>
Update voor 7 dec
</commit_message>
<xml_diff>
--- a/Handleidingen/Borduren - leerlingenhandleiding v0.2.docx
+++ b/Handleidingen/Borduren - leerlingenhandleiding v0.2.docx
@@ -611,7 +611,7 @@
         <mc:AlternateContent>
           <mc:Choice Requires="wps">
             <w:drawing>
-              <wp:anchor distT="0" distB="0" distL="114300" distR="114300" simplePos="0" relativeHeight="251819008" behindDoc="0" locked="0" layoutInCell="1" allowOverlap="1" wp14:anchorId="087E7EF7" wp14:editId="25D621C4">
+              <wp:anchor distT="0" distB="0" distL="114300" distR="114300" simplePos="0" relativeHeight="251817984" behindDoc="0" locked="0" layoutInCell="1" allowOverlap="1" wp14:anchorId="087E7EF7" wp14:editId="44EFDC4B">
                 <wp:simplePos x="0" y="0"/>
                 <wp:positionH relativeFrom="column">
                   <wp:posOffset>2385060</wp:posOffset>
@@ -741,7 +741,7 @@
                   <v:h position="#0,#1"/>
                 </v:handles>
               </v:shapetype>
-              <v:shape id="Speech Bubble: Rectangle with Corners Rounded 1" o:spid="_x0000_s1026" type="#_x0000_t62" style="position:absolute;margin-left:187.8pt;margin-top:355.5pt;width:137.75pt;height:26.45pt;z-index:251819008;visibility:visible;mso-wrap-style:square;mso-width-percent:0;mso-height-percent:0;mso-wrap-distance-left:9pt;mso-wrap-distance-top:0;mso-wrap-distance-right:9pt;mso-wrap-distance-bottom:0;mso-position-horizontal:absolute;mso-position-horizontal-relative:text;mso-position-vertical:absolute;mso-position-vertical-relative:text;mso-width-percent:0;mso-height-percent:0;mso-width-relative:margin;mso-height-relative:margin;v-text-anchor:middle" o:gfxdata="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" adj="16452,18808" fillcolor="#156082 [3204]" strokecolor="#030e13 [484]" strokeweight="1pt">
+              <v:shape id="Speech Bubble: Rectangle with Corners Rounded 1" o:spid="_x0000_s1026" type="#_x0000_t62" style="position:absolute;margin-left:187.8pt;margin-top:355.5pt;width:137.75pt;height:26.45pt;z-index:251817984;visibility:visible;mso-wrap-style:square;mso-width-percent:0;mso-height-percent:0;mso-wrap-distance-left:9pt;mso-wrap-distance-top:0;mso-wrap-distance-right:9pt;mso-wrap-distance-bottom:0;mso-position-horizontal:absolute;mso-position-horizontal-relative:text;mso-position-vertical:absolute;mso-position-vertical-relative:text;mso-width-percent:0;mso-height-percent:0;mso-width-relative:margin;mso-height-relative:margin;v-text-anchor:middle" o:gfxdata="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" adj="16452,18808" fillcolor="#156082 [3204]" strokecolor="#030e13 [484]" strokeweight="1pt">
                 <v:textbox>
                   <w:txbxContent>
                     <w:p>
@@ -773,7 +773,7 @@
         <mc:AlternateContent>
           <mc:Choice Requires="wps">
             <w:drawing>
-              <wp:anchor distT="0" distB="0" distL="114300" distR="114300" simplePos="0" relativeHeight="251760640" behindDoc="0" locked="0" layoutInCell="1" allowOverlap="1" wp14:anchorId="52D0FBE6" wp14:editId="3EB08CC0">
+              <wp:anchor distT="0" distB="0" distL="114300" distR="114300" simplePos="0" relativeHeight="251759616" behindDoc="0" locked="0" layoutInCell="1" allowOverlap="1" wp14:anchorId="52D0FBE6" wp14:editId="4B2230A6">
                 <wp:simplePos x="0" y="0"/>
                 <wp:positionH relativeFrom="column">
                   <wp:posOffset>5352906</wp:posOffset>
@@ -862,52 +862,7 @@
           </mc:Choice>
           <mc:Fallback>
             <w:pict>
-              <v:shapetype w14:anchorId="52D0FBE6" id="_x0000_t62" coordsize="21600,21600" o:spt="62" adj="1350,25920" path="m3600,qx,3600l0@8@12@24,0@9,,18000qy3600,21600l@6,21600@15@27@7,21600,18000,21600qx21600,18000l21600@9@18@30,21600@8,21600,3600qy18000,l@7,0@21@33@6,xe">
-                <v:stroke joinstyle="miter"/>
-                <v:formulas>
-                  <v:f eqn="sum 10800 0 #0"/>
-                  <v:f eqn="sum 10800 0 #1"/>
-                  <v:f eqn="sum #0 0 #1"/>
-                  <v:f eqn="sum @0 @1 0"/>
-                  <v:f eqn="sum 21600 0 #0"/>
-                  <v:f eqn="sum 21600 0 #1"/>
-                  <v:f eqn="if @0 3600 12600"/>
-                  <v:f eqn="if @0 9000 18000"/>
-                  <v:f eqn="if @1 3600 12600"/>
-                  <v:f eqn="if @1 9000 18000"/>
-                  <v:f eqn="if @2 0 #0"/>
-                  <v:f eqn="if @3 @10 0"/>
-                  <v:f eqn="if #0 0 @11"/>
-                  <v:f eqn="if @2 @6 #0"/>
-                  <v:f eqn="if @3 @6 @13"/>
-                  <v:f eqn="if @5 @6 @14"/>
-                  <v:f eqn="if @2 #0 21600"/>
-                  <v:f eqn="if @3 21600 @16"/>
-                  <v:f eqn="if @4 21600 @17"/>
-                  <v:f eqn="if @2 #0 @6"/>
-                  <v:f eqn="if @3 @19 @6"/>
-                  <v:f eqn="if #1 @6 @20"/>
-                  <v:f eqn="if @2 @8 #1"/>
-                  <v:f eqn="if @3 @22 @8"/>
-                  <v:f eqn="if #0 @8 @23"/>
-                  <v:f eqn="if @2 21600 #1"/>
-                  <v:f eqn="if @3 21600 @25"/>
-                  <v:f eqn="if @5 21600 @26"/>
-                  <v:f eqn="if @2 #1 @8"/>
-                  <v:f eqn="if @3 @8 @28"/>
-                  <v:f eqn="if @4 @8 @29"/>
-                  <v:f eqn="if @2 #1 0"/>
-                  <v:f eqn="if @3 @31 0"/>
-                  <v:f eqn="if #1 0 @32"/>
-                  <v:f eqn="val #0"/>
-                  <v:f eqn="val #1"/>
-                </v:formulas>
-                <v:path o:connecttype="custom" o:connectlocs="10800,0;0,10800;10800,21600;21600,10800;@34,@35" textboxrect="791,791,20809,20809"/>
-                <v:handles>
-                  <v:h position="#0,#1"/>
-                </v:handles>
-              </v:shapetype>
-              <v:shape id="Speech Bubble: Rectangle with Corners Rounded 1" o:spid="_x0000_s1026" type="#_x0000_t62" style="position:absolute;margin-left:421.5pt;margin-top:55.5pt;width:183.35pt;height:27.9pt;z-index:251760640;visibility:visible;mso-wrap-style:square;mso-width-percent:0;mso-height-percent:0;mso-wrap-distance-left:9pt;mso-wrap-distance-top:0;mso-wrap-distance-right:9pt;mso-wrap-distance-bottom:0;mso-position-horizontal:absolute;mso-position-horizontal-relative:text;mso-position-vertical:absolute;mso-position-vertical-relative:text;mso-width-percent:0;mso-height-percent:0;mso-width-relative:margin;mso-height-relative:margin;v-text-anchor:middle" o:gfxdata="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" adj="16264,47466" fillcolor="#156082 [3204]" strokecolor="#030e13 [484]" strokeweight="1pt">
+              <v:shape w14:anchorId="52D0FBE6" id="_x0000_s1027" type="#_x0000_t62" style="position:absolute;margin-left:421.5pt;margin-top:55.5pt;width:183.35pt;height:27.9pt;z-index:251759616;visibility:visible;mso-wrap-style:square;mso-width-percent:0;mso-height-percent:0;mso-wrap-distance-left:9pt;mso-wrap-distance-top:0;mso-wrap-distance-right:9pt;mso-wrap-distance-bottom:0;mso-position-horizontal:absolute;mso-position-horizontal-relative:text;mso-position-vertical:absolute;mso-position-vertical-relative:text;mso-width-percent:0;mso-height-percent:0;mso-width-relative:margin;mso-height-relative:margin;v-text-anchor:middle" o:gfxdata="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" adj="16264,47466" fillcolor="#156082 [3204]" strokecolor="#030e13 [484]" strokeweight="1pt">
                 <v:textbox>
                   <w:txbxContent>
                     <w:p>
@@ -943,7 +898,7 @@
         <mc:AlternateContent>
           <mc:Choice Requires="wps">
             <w:drawing>
-              <wp:anchor distT="0" distB="0" distL="114300" distR="114300" simplePos="0" relativeHeight="251756544" behindDoc="0" locked="0" layoutInCell="1" allowOverlap="1" wp14:anchorId="133DA357" wp14:editId="33BF98F0">
+              <wp:anchor distT="0" distB="0" distL="114300" distR="114300" simplePos="0" relativeHeight="251755520" behindDoc="0" locked="0" layoutInCell="1" allowOverlap="1" wp14:anchorId="133DA357" wp14:editId="6BC919A4">
                 <wp:simplePos x="0" y="0"/>
                 <wp:positionH relativeFrom="column">
                   <wp:posOffset>2285497</wp:posOffset>
@@ -1032,7 +987,7 @@
           </mc:Choice>
           <mc:Fallback>
             <w:pict>
-              <v:shape w14:anchorId="133DA357" id="_x0000_s1027" type="#_x0000_t62" style="position:absolute;margin-left:179.95pt;margin-top:22.2pt;width:154.6pt;height:59.75pt;z-index:251756544;visibility:visible;mso-wrap-style:square;mso-width-percent:0;mso-height-percent:0;mso-wrap-distance-left:9pt;mso-wrap-distance-top:0;mso-wrap-distance-right:9pt;mso-wrap-distance-bottom:0;mso-position-horizontal:absolute;mso-position-horizontal-relative:text;mso-position-vertical:absolute;mso-position-vertical-relative:text;mso-width-percent:0;mso-height-percent:0;mso-width-relative:margin;mso-height-relative:margin;v-text-anchor:middle" o:gfxdata="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" adj="-10586,11275" fillcolor="#156082 [3204]" strokecolor="#030e13 [484]" strokeweight="1pt">
+              <v:shape w14:anchorId="133DA357" id="_x0000_s1028" type="#_x0000_t62" style="position:absolute;margin-left:179.95pt;margin-top:22.2pt;width:154.6pt;height:59.75pt;z-index:251755520;visibility:visible;mso-wrap-style:square;mso-width-percent:0;mso-height-percent:0;mso-wrap-distance-left:9pt;mso-wrap-distance-top:0;mso-wrap-distance-right:9pt;mso-wrap-distance-bottom:0;mso-position-horizontal:absolute;mso-position-horizontal-relative:text;mso-position-vertical:absolute;mso-position-vertical-relative:text;mso-width-percent:0;mso-height-percent:0;mso-width-relative:margin;mso-height-relative:margin;v-text-anchor:middle" o:gfxdata="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" adj="-10586,11275" fillcolor="#156082 [3204]" strokecolor="#030e13 [484]" strokeweight="1pt">
                 <v:textbox>
                   <w:txbxContent>
                     <w:p>
@@ -1068,7 +1023,7 @@
         <mc:AlternateContent>
           <mc:Choice Requires="wps">
             <w:drawing>
-              <wp:anchor distT="0" distB="0" distL="114300" distR="114300" simplePos="0" relativeHeight="251762688" behindDoc="0" locked="0" layoutInCell="1" allowOverlap="1" wp14:anchorId="25A15AB5" wp14:editId="5D08BE31">
+              <wp:anchor distT="0" distB="0" distL="114300" distR="114300" simplePos="0" relativeHeight="251761664" behindDoc="0" locked="0" layoutInCell="1" allowOverlap="1" wp14:anchorId="25A15AB5" wp14:editId="79B11A7B">
                 <wp:simplePos x="0" y="0"/>
                 <wp:positionH relativeFrom="column">
                   <wp:posOffset>6073576</wp:posOffset>
@@ -1169,7 +1124,7 @@
           </mc:Choice>
           <mc:Fallback>
             <w:pict>
-              <v:shape w14:anchorId="25A15AB5" id="_x0000_s1029" type="#_x0000_t62" style="position:absolute;margin-left:478.25pt;margin-top:163.55pt;width:137.75pt;height:42.95pt;z-index:251762688;visibility:visible;mso-wrap-style:square;mso-width-percent:0;mso-height-percent:0;mso-wrap-distance-left:9pt;mso-wrap-distance-top:0;mso-wrap-distance-right:9pt;mso-wrap-distance-bottom:0;mso-position-horizontal:absolute;mso-position-horizontal-relative:text;mso-position-vertical:absolute;mso-position-vertical-relative:text;mso-width-percent:0;mso-height-percent:0;mso-width-relative:margin;mso-height-relative:margin;v-text-anchor:middle" o:gfxdata="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" adj="16452,18808" fillcolor="#156082 [3204]" strokecolor="#030e13 [484]" strokeweight="1pt">
+              <v:shape w14:anchorId="25A15AB5" id="_x0000_s1029" type="#_x0000_t62" style="position:absolute;margin-left:478.25pt;margin-top:163.55pt;width:137.75pt;height:42.95pt;z-index:251761664;visibility:visible;mso-wrap-style:square;mso-width-percent:0;mso-height-percent:0;mso-wrap-distance-left:9pt;mso-wrap-distance-top:0;mso-wrap-distance-right:9pt;mso-wrap-distance-bottom:0;mso-position-horizontal:absolute;mso-position-horizontal-relative:text;mso-position-vertical:absolute;mso-position-vertical-relative:text;mso-width-percent:0;mso-height-percent:0;mso-width-relative:margin;mso-height-relative:margin;v-text-anchor:middle" o:gfxdata="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" adj="16452,18808" fillcolor="#156082 [3204]" strokecolor="#030e13 [484]" strokeweight="1pt">
                 <v:textbox>
                   <w:txbxContent>
                     <w:p>
@@ -1217,7 +1172,7 @@
         <mc:AlternateContent>
           <mc:Choice Requires="wps">
             <w:drawing>
-              <wp:anchor distT="0" distB="0" distL="114300" distR="114300" simplePos="0" relativeHeight="251758592" behindDoc="0" locked="0" layoutInCell="1" allowOverlap="1" wp14:anchorId="63C87116" wp14:editId="134B3660">
+              <wp:anchor distT="0" distB="0" distL="114300" distR="114300" simplePos="0" relativeHeight="251757568" behindDoc="0" locked="0" layoutInCell="1" allowOverlap="1" wp14:anchorId="63C87116" wp14:editId="1CE9A9C2">
                 <wp:simplePos x="0" y="0"/>
                 <wp:positionH relativeFrom="column">
                   <wp:posOffset>2968710</wp:posOffset>
@@ -1301,7 +1256,7 @@
           </mc:Choice>
           <mc:Fallback>
             <w:pict>
-              <v:shape w14:anchorId="63C87116" id="_x0000_s1029" type="#_x0000_t62" style="position:absolute;margin-left:233.75pt;margin-top:257.9pt;width:165.2pt;height:65.45pt;z-index:251758592;visibility:visible;mso-wrap-style:square;mso-width-percent:0;mso-height-percent:0;mso-wrap-distance-left:9pt;mso-wrap-distance-top:0;mso-wrap-distance-right:9pt;mso-wrap-distance-bottom:0;mso-position-horizontal:absolute;mso-position-horizontal-relative:text;mso-position-vertical:absolute;mso-position-vertical-relative:text;mso-width-percent:0;mso-height-percent:0;mso-width-relative:margin;mso-height-relative:margin;v-text-anchor:middle" o:gfxdata="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" adj="12319,-48620" fillcolor="#156082 [3204]" strokecolor="#030e13 [484]" strokeweight="1pt">
+              <v:shape w14:anchorId="63C87116" id="_x0000_s1030" type="#_x0000_t62" style="position:absolute;margin-left:233.75pt;margin-top:257.9pt;width:165.2pt;height:65.45pt;z-index:251757568;visibility:visible;mso-wrap-style:square;mso-width-percent:0;mso-height-percent:0;mso-wrap-distance-left:9pt;mso-wrap-distance-top:0;mso-wrap-distance-right:9pt;mso-wrap-distance-bottom:0;mso-position-horizontal:absolute;mso-position-horizontal-relative:text;mso-position-vertical:absolute;mso-position-vertical-relative:text;mso-width-percent:0;mso-height-percent:0;mso-width-relative:margin;mso-height-relative:margin;v-text-anchor:middle" o:gfxdata="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" adj="12319,-48620" fillcolor="#156082 [3204]" strokecolor="#030e13 [484]" strokeweight="1pt">
                 <v:textbox>
                   <w:txbxContent>
                     <w:p>
@@ -1332,7 +1287,7 @@
         <mc:AlternateContent>
           <mc:Choice Requires="wps">
             <w:drawing>
-              <wp:anchor distT="0" distB="0" distL="114300" distR="114300" simplePos="0" relativeHeight="251754496" behindDoc="0" locked="0" layoutInCell="1" allowOverlap="1" wp14:anchorId="7386C8B3" wp14:editId="67B3FBAD">
+              <wp:anchor distT="0" distB="0" distL="114300" distR="114300" simplePos="0" relativeHeight="251753472" behindDoc="0" locked="0" layoutInCell="1" allowOverlap="1" wp14:anchorId="7386C8B3" wp14:editId="6748B809">
                 <wp:simplePos x="0" y="0"/>
                 <wp:positionH relativeFrom="column">
                   <wp:posOffset>1904185</wp:posOffset>
@@ -1439,7 +1394,7 @@
           </mc:Choice>
           <mc:Fallback>
             <w:pict>
-              <v:shape w14:anchorId="7386C8B3" id="_x0000_s1030" type="#_x0000_t62" style="position:absolute;margin-left:149.95pt;margin-top:160.8pt;width:165.2pt;height:88.45pt;z-index:251754496;visibility:visible;mso-wrap-style:square;mso-width-percent:0;mso-height-percent:0;mso-wrap-distance-left:9pt;mso-wrap-distance-top:0;mso-wrap-distance-right:9pt;mso-wrap-distance-bottom:0;mso-position-horizontal:absolute;mso-position-horizontal-relative:text;mso-position-vertical:absolute;mso-position-vertical-relative:text;mso-width-percent:0;mso-height-percent:0;mso-width-relative:margin;mso-height-relative:margin;v-text-anchor:middle" o:gfxdata="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" adj="10563,-12285" fillcolor="#156082 [3204]" strokecolor="#030e13 [484]" strokeweight="1pt">
+              <v:shape w14:anchorId="7386C8B3" id="_x0000_s1031" type="#_x0000_t62" style="position:absolute;margin-left:149.95pt;margin-top:160.8pt;width:165.2pt;height:88.45pt;z-index:251753472;visibility:visible;mso-wrap-style:square;mso-width-percent:0;mso-height-percent:0;mso-wrap-distance-left:9pt;mso-wrap-distance-top:0;mso-wrap-distance-right:9pt;mso-wrap-distance-bottom:0;mso-position-horizontal:absolute;mso-position-horizontal-relative:text;mso-position-vertical:absolute;mso-position-vertical-relative:text;mso-width-percent:0;mso-height-percent:0;mso-width-relative:margin;mso-height-relative:margin;v-text-anchor:middle" o:gfxdata="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" adj="10563,-12285" fillcolor="#156082 [3204]" strokecolor="#030e13 [484]" strokeweight="1pt">
                 <v:textbox>
                   <w:txbxContent>
                     <w:p>
@@ -1567,7 +1522,7 @@
         <mc:AlternateContent>
           <mc:Choice Requires="wps">
             <w:drawing>
-              <wp:anchor distT="0" distB="0" distL="114300" distR="114300" simplePos="0" relativeHeight="251779072" behindDoc="0" locked="0" layoutInCell="1" allowOverlap="1" wp14:anchorId="02BAFD90" wp14:editId="51F719B5">
+              <wp:anchor distT="0" distB="0" distL="114300" distR="114300" simplePos="0" relativeHeight="251778048" behindDoc="0" locked="0" layoutInCell="1" allowOverlap="1" wp14:anchorId="02BAFD90" wp14:editId="779A9E4D">
                 <wp:simplePos x="0" y="0"/>
                 <wp:positionH relativeFrom="column">
                   <wp:posOffset>1099185</wp:posOffset>
@@ -1630,7 +1585,7 @@
                 <v:stroke joinstyle="miter"/>
                 <v:path gradientshapeok="t" o:connecttype="rect"/>
               </v:shapetype>
-              <v:shape id="Text Box 3" o:spid="_x0000_s1031" type="#_x0000_t202" style="position:absolute;margin-left:86.55pt;margin-top:258.5pt;width:148.25pt;height:22.95pt;rotation:-90;z-index:251779072;visibility:visible;mso-wrap-style:square;mso-width-percent:0;mso-height-percent:0;mso-wrap-distance-left:9pt;mso-wrap-distance-top:0;mso-wrap-distance-right:9pt;mso-wrap-distance-bottom:0;mso-position-horizontal:absolute;mso-position-horizontal-relative:text;mso-position-vertical:absolute;mso-position-vertical-relative:text;mso-width-percent:0;mso-height-percent:0;mso-width-relative:margin;mso-height-relative:margin;v-text-anchor:top" o:gfxdata="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" filled="f" stroked="f" strokeweight=".5pt">
+              <v:shape id="Text Box 3" o:spid="_x0000_s1032" type="#_x0000_t202" style="position:absolute;margin-left:86.55pt;margin-top:258.5pt;width:148.25pt;height:22.95pt;rotation:-90;z-index:251778048;visibility:visible;mso-wrap-style:square;mso-width-percent:0;mso-height-percent:0;mso-wrap-distance-left:9pt;mso-wrap-distance-top:0;mso-wrap-distance-right:9pt;mso-wrap-distance-bottom:0;mso-position-horizontal:absolute;mso-position-horizontal-relative:text;mso-position-vertical:absolute;mso-position-vertical-relative:text;mso-width-percent:0;mso-height-percent:0;mso-width-relative:margin;mso-height-relative:margin;v-text-anchor:top" o:gfxdata="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" filled="f" stroked="f" strokeweight=".5pt">
                 <v:textbox>
                   <w:txbxContent>
                     <w:p>
@@ -1652,7 +1607,7 @@
         <mc:AlternateContent>
           <mc:Choice Requires="wps">
             <w:drawing>
-              <wp:anchor distT="0" distB="0" distL="114300" distR="114300" simplePos="0" relativeHeight="251777024" behindDoc="0" locked="0" layoutInCell="1" allowOverlap="1" wp14:anchorId="34574AE8" wp14:editId="5EE9FF61">
+              <wp:anchor distT="0" distB="0" distL="114300" distR="114300" simplePos="0" relativeHeight="251776000" behindDoc="0" locked="0" layoutInCell="1" allowOverlap="1" wp14:anchorId="34574AE8" wp14:editId="2B1FA21B">
                 <wp:simplePos x="0" y="0"/>
                 <wp:positionH relativeFrom="column">
                   <wp:posOffset>-210981</wp:posOffset>
@@ -1705,11 +1660,11 @@
           </mc:Choice>
           <mc:Fallback>
             <w:pict>
-              <v:shapetype w14:anchorId="4876E1FE" id="_x0000_t32" coordsize="21600,21600" o:spt="32" o:oned="t" path="m,l21600,21600e" filled="f">
+              <v:shapetype w14:anchorId="19982B77" id="_x0000_t32" coordsize="21600,21600" o:spt="32" o:oned="t" path="m,l21600,21600e" filled="f">
                 <v:path arrowok="t" fillok="f" o:connecttype="none"/>
                 <o:lock v:ext="edit" shapetype="t"/>
               </v:shapetype>
-              <v:shape id="Straight Arrow Connector 2" o:spid="_x0000_s1026" type="#_x0000_t32" style="position:absolute;margin-left:-16.6pt;margin-top:201.95pt;width:371.8pt;height:0;rotation:90;z-index:251777024;visibility:visible;mso-wrap-style:square;mso-wrap-distance-left:9pt;mso-wrap-distance-top:0;mso-wrap-distance-right:9pt;mso-wrap-distance-bottom:0;mso-position-horizontal:absolute;mso-position-horizontal-relative:text;mso-position-vertical:absolute;mso-position-vertical-relative:text" o:gfxdata="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" strokecolor="#156082 [3204]" strokeweight=".5pt">
+              <v:shape id="Straight Arrow Connector 2" o:spid="_x0000_s1026" type="#_x0000_t32" style="position:absolute;margin-left:-16.6pt;margin-top:201.95pt;width:371.8pt;height:0;rotation:90;z-index:251776000;visibility:visible;mso-wrap-style:square;mso-wrap-distance-left:9pt;mso-wrap-distance-top:0;mso-wrap-distance-right:9pt;mso-wrap-distance-bottom:0;mso-position-horizontal:absolute;mso-position-horizontal-relative:text;mso-position-vertical:absolute;mso-position-vertical-relative:text" o:gfxdata="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" strokecolor="#156082 [3204]" strokeweight=".5pt">
                 <v:stroke startarrow="block" endarrow="block" joinstyle="miter"/>
               </v:shape>
             </w:pict>
@@ -1723,7 +1678,7 @@
         <mc:AlternateContent>
           <mc:Choice Requires="wps">
             <w:drawing>
-              <wp:anchor distT="0" distB="0" distL="114300" distR="114300" simplePos="0" relativeHeight="251789312" behindDoc="0" locked="0" layoutInCell="1" allowOverlap="1" wp14:anchorId="4D2C0D82" wp14:editId="10114471">
+              <wp:anchor distT="0" distB="0" distL="114300" distR="114300" simplePos="0" relativeHeight="251788288" behindDoc="0" locked="0" layoutInCell="1" allowOverlap="1" wp14:anchorId="4D2C0D82" wp14:editId="1FBD8710">
                 <wp:simplePos x="0" y="0"/>
                 <wp:positionH relativeFrom="column">
                   <wp:posOffset>2616835</wp:posOffset>
@@ -1825,7 +1780,7 @@
                   <v:h position="#0,#1" xrange="0,21600" yrange="0,10800"/>
                 </v:handles>
               </v:shapetype>
-              <v:shape id="Arrow: Right 6" o:spid="_x0000_s1032" type="#_x0000_t13" style="position:absolute;margin-left:206.05pt;margin-top:184.5pt;width:74.7pt;height:35.05pt;rotation:180;z-index:251789312;visibility:visible;mso-wrap-style:square;mso-height-percent:0;mso-wrap-distance-left:9pt;mso-wrap-distance-top:0;mso-wrap-distance-right:9pt;mso-wrap-distance-bottom:0;mso-position-horizontal:absolute;mso-position-horizontal-relative:text;mso-position-vertical:absolute;mso-position-vertical-relative:text;mso-height-percent:0;mso-height-relative:margin;v-text-anchor:middle" o:gfxdata="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" adj="16533" fillcolor="yellow" strokecolor="#030e13 [484]" strokeweight="1pt">
+              <v:shape id="Arrow: Right 6" o:spid="_x0000_s1033" type="#_x0000_t13" style="position:absolute;margin-left:206.05pt;margin-top:184.5pt;width:74.7pt;height:35.05pt;rotation:180;z-index:251788288;visibility:visible;mso-wrap-style:square;mso-height-percent:0;mso-wrap-distance-left:9pt;mso-wrap-distance-top:0;mso-wrap-distance-right:9pt;mso-wrap-distance-bottom:0;mso-position-horizontal:absolute;mso-position-horizontal-relative:text;mso-position-vertical:absolute;mso-position-vertical-relative:text;mso-height-percent:0;mso-height-relative:margin;v-text-anchor:middle" o:gfxdata="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" adj="16533" fillcolor="yellow" strokecolor="#030e13 [484]" strokeweight="1pt">
                 <v:textbox inset="0,0,0,0">
                   <w:txbxContent>
                     <w:p>
@@ -1862,7 +1817,7 @@
         <mc:AlternateContent>
           <mc:Choice Requires="wps">
             <w:drawing>
-              <wp:anchor distT="0" distB="0" distL="114300" distR="114300" simplePos="0" relativeHeight="251787264" behindDoc="0" locked="0" layoutInCell="1" allowOverlap="1" wp14:anchorId="08B2BAB2" wp14:editId="017B4A8B">
+              <wp:anchor distT="0" distB="0" distL="114300" distR="114300" simplePos="0" relativeHeight="251786240" behindDoc="0" locked="0" layoutInCell="1" allowOverlap="1" wp14:anchorId="08B2BAB2" wp14:editId="0D44B417">
                 <wp:simplePos x="0" y="0"/>
                 <wp:positionH relativeFrom="column">
                   <wp:posOffset>3564165</wp:posOffset>
@@ -1942,7 +1897,7 @@
           </mc:Choice>
           <mc:Fallback>
             <w:pict>
-              <v:shape w14:anchorId="08B2BAB2" id="_x0000_s1033" type="#_x0000_t13" style="position:absolute;margin-left:280.65pt;margin-top:109.3pt;width:74.7pt;height:35.05pt;rotation:-90;z-index:251787264;visibility:visible;mso-wrap-style:square;mso-height-percent:0;mso-wrap-distance-left:9pt;mso-wrap-distance-top:0;mso-wrap-distance-right:9pt;mso-wrap-distance-bottom:0;mso-position-horizontal:absolute;mso-position-horizontal-relative:text;mso-position-vertical:absolute;mso-position-vertical-relative:text;mso-height-percent:0;mso-height-relative:margin;v-text-anchor:middle" o:gfxdata="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" adj="16533" fillcolor="yellow" strokecolor="#030e13 [484]" strokeweight="1pt">
+              <v:shape w14:anchorId="08B2BAB2" id="_x0000_s1034" type="#_x0000_t13" style="position:absolute;margin-left:280.65pt;margin-top:109.3pt;width:74.7pt;height:35.05pt;rotation:-90;z-index:251786240;visibility:visible;mso-wrap-style:square;mso-height-percent:0;mso-wrap-distance-left:9pt;mso-wrap-distance-top:0;mso-wrap-distance-right:9pt;mso-wrap-distance-bottom:0;mso-position-horizontal:absolute;mso-position-horizontal-relative:text;mso-position-vertical:absolute;mso-position-vertical-relative:text;mso-height-percent:0;mso-height-relative:margin;v-text-anchor:middle" o:gfxdata="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" adj="16533" fillcolor="yellow" strokecolor="#030e13 [484]" strokeweight="1pt">
                 <v:textbox inset="0,0,0,0">
                   <w:txbxContent>
                     <w:p>
@@ -1973,7 +1928,7 @@
         <mc:AlternateContent>
           <mc:Choice Requires="wps">
             <w:drawing>
-              <wp:anchor distT="0" distB="0" distL="114300" distR="114300" simplePos="0" relativeHeight="251785216" behindDoc="0" locked="0" layoutInCell="1" allowOverlap="1" wp14:anchorId="3A330AB6" wp14:editId="71E75F67">
+              <wp:anchor distT="0" distB="0" distL="114300" distR="114300" simplePos="0" relativeHeight="251784192" behindDoc="0" locked="0" layoutInCell="1" allowOverlap="1" wp14:anchorId="3A330AB6" wp14:editId="3A9BFCF9">
                 <wp:simplePos x="0" y="0"/>
                 <wp:positionH relativeFrom="column">
                   <wp:posOffset>3567182</wp:posOffset>
@@ -2062,7 +2017,7 @@
           </mc:Choice>
           <mc:Fallback>
             <w:pict>
-              <v:shape w14:anchorId="3A330AB6" id="_x0000_s1034" type="#_x0000_t13" style="position:absolute;margin-left:280.9pt;margin-top:260.4pt;width:74.55pt;height:35.15pt;rotation:90;z-index:251785216;visibility:visible;mso-wrap-style:square;mso-width-percent:0;mso-height-percent:0;mso-wrap-distance-left:9pt;mso-wrap-distance-top:0;mso-wrap-distance-right:9pt;mso-wrap-distance-bottom:0;mso-position-horizontal:absolute;mso-position-horizontal-relative:text;mso-position-vertical:absolute;mso-position-vertical-relative:text;mso-width-percent:0;mso-height-percent:0;mso-width-relative:margin;mso-height-relative:margin;v-text-anchor:middle" o:gfxdata="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" adj="16508" fillcolor="yellow" strokecolor="#030e13 [484]" strokeweight="1pt">
+              <v:shape w14:anchorId="3A330AB6" id="_x0000_s1035" type="#_x0000_t13" style="position:absolute;margin-left:280.9pt;margin-top:260.4pt;width:74.55pt;height:35.15pt;rotation:90;z-index:251784192;visibility:visible;mso-wrap-style:square;mso-width-percent:0;mso-height-percent:0;mso-wrap-distance-left:9pt;mso-wrap-distance-top:0;mso-wrap-distance-right:9pt;mso-wrap-distance-bottom:0;mso-position-horizontal:absolute;mso-position-horizontal-relative:text;mso-position-vertical:absolute;mso-position-vertical-relative:text;mso-width-percent:0;mso-height-percent:0;mso-width-relative:margin;mso-height-relative:margin;v-text-anchor:middle" o:gfxdata="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" adj="16508" fillcolor="yellow" strokecolor="#030e13 [484]" strokeweight="1pt">
                 <v:textbox inset="0,0,0,0">
                   <w:txbxContent>
                     <w:p>
@@ -2099,7 +2054,7 @@
         <mc:AlternateContent>
           <mc:Choice Requires="wps">
             <w:drawing>
-              <wp:anchor distT="0" distB="0" distL="114300" distR="114300" simplePos="0" relativeHeight="251773952" behindDoc="0" locked="0" layoutInCell="1" allowOverlap="1" wp14:anchorId="59AFC73A" wp14:editId="5443F95D">
+              <wp:anchor distT="0" distB="0" distL="114300" distR="114300" simplePos="0" relativeHeight="251772928" behindDoc="0" locked="0" layoutInCell="1" allowOverlap="1" wp14:anchorId="59AFC73A" wp14:editId="6C472CF2">
                 <wp:simplePos x="0" y="0"/>
                 <wp:positionH relativeFrom="column">
                   <wp:posOffset>1712301</wp:posOffset>
@@ -2152,7 +2107,7 @@
           </mc:Choice>
           <mc:Fallback>
             <w:pict>
-              <v:shape w14:anchorId="1686B6E7" id="Straight Arrow Connector 2" o:spid="_x0000_s1026" type="#_x0000_t32" style="position:absolute;margin-left:134.85pt;margin-top:71.65pt;width:371.8pt;height:0;z-index:251773952;visibility:visible;mso-wrap-style:square;mso-wrap-distance-left:9pt;mso-wrap-distance-top:0;mso-wrap-distance-right:9pt;mso-wrap-distance-bottom:0;mso-position-horizontal:absolute;mso-position-horizontal-relative:text;mso-position-vertical:absolute;mso-position-vertical-relative:text" o:gfxdata="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" strokecolor="#156082 [3204]" strokeweight=".5pt">
+              <v:shape w14:anchorId="690407A7" id="Straight Arrow Connector 2" o:spid="_x0000_s1026" type="#_x0000_t32" style="position:absolute;margin-left:134.85pt;margin-top:71.65pt;width:371.8pt;height:0;z-index:251772928;visibility:visible;mso-wrap-style:square;mso-wrap-distance-left:9pt;mso-wrap-distance-top:0;mso-wrap-distance-right:9pt;mso-wrap-distance-bottom:0;mso-position-horizontal:absolute;mso-position-horizontal-relative:text;mso-position-vertical:absolute;mso-position-vertical-relative:text" o:gfxdata="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" strokecolor="#156082 [3204]" strokeweight=".5pt">
                 <v:stroke startarrow="block" endarrow="block" joinstyle="miter"/>
               </v:shape>
             </w:pict>
@@ -2166,7 +2121,7 @@
         <mc:AlternateContent>
           <mc:Choice Requires="wps">
             <w:drawing>
-              <wp:anchor distT="0" distB="0" distL="114300" distR="114300" simplePos="0" relativeHeight="251774976" behindDoc="0" locked="0" layoutInCell="1" allowOverlap="1" wp14:anchorId="761A9C3E" wp14:editId="4EC24F68">
+              <wp:anchor distT="0" distB="0" distL="114300" distR="114300" simplePos="0" relativeHeight="251773952" behindDoc="0" locked="0" layoutInCell="1" allowOverlap="1" wp14:anchorId="761A9C3E" wp14:editId="0194236C">
                 <wp:simplePos x="0" y="0"/>
                 <wp:positionH relativeFrom="column">
                   <wp:posOffset>3214370</wp:posOffset>
@@ -2225,7 +2180,7 @@
           </mc:Choice>
           <mc:Fallback>
             <w:pict>
-              <v:shape w14:anchorId="761A9C3E" id="_x0000_s1035" type="#_x0000_t202" style="position:absolute;margin-left:253.1pt;margin-top:53.15pt;width:148.3pt;height:22.95pt;z-index:251774976;visibility:visible;mso-wrap-style:square;mso-width-percent:0;mso-height-percent:0;mso-wrap-distance-left:9pt;mso-wrap-distance-top:0;mso-wrap-distance-right:9pt;mso-wrap-distance-bottom:0;mso-position-horizontal:absolute;mso-position-horizontal-relative:text;mso-position-vertical:absolute;mso-position-vertical-relative:text;mso-width-percent:0;mso-height-percent:0;mso-width-relative:margin;mso-height-relative:margin;v-text-anchor:top" o:gfxdata="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" filled="f" stroked="f" strokeweight=".5pt">
+              <v:shape w14:anchorId="761A9C3E" id="_x0000_s1036" type="#_x0000_t202" style="position:absolute;margin-left:253.1pt;margin-top:53.15pt;width:148.3pt;height:22.95pt;z-index:251773952;visibility:visible;mso-wrap-style:square;mso-width-percent:0;mso-height-percent:0;mso-wrap-distance-left:9pt;mso-wrap-distance-top:0;mso-wrap-distance-right:9pt;mso-wrap-distance-bottom:0;mso-position-horizontal:absolute;mso-position-horizontal-relative:text;mso-position-vertical:absolute;mso-position-vertical-relative:text;mso-width-percent:0;mso-height-percent:0;mso-width-relative:margin;mso-height-relative:margin;v-text-anchor:top" o:gfxdata="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" filled="f" stroked="f" strokeweight=".5pt">
                 <v:textbox>
                   <w:txbxContent>
                     <w:p>
@@ -2247,7 +2202,7 @@
         <mc:AlternateContent>
           <mc:Choice Requires="wps">
             <w:drawing>
-              <wp:anchor distT="0" distB="0" distL="114300" distR="114300" simplePos="0" relativeHeight="251783168" behindDoc="0" locked="0" layoutInCell="1" allowOverlap="1" wp14:anchorId="3DC4D6D7" wp14:editId="0F6D34D5">
+              <wp:anchor distT="0" distB="0" distL="114300" distR="114300" simplePos="0" relativeHeight="251782144" behindDoc="0" locked="0" layoutInCell="1" allowOverlap="1" wp14:anchorId="3DC4D6D7" wp14:editId="33540DA3">
                 <wp:simplePos x="0" y="0"/>
                 <wp:positionH relativeFrom="column">
                   <wp:posOffset>4544913</wp:posOffset>
@@ -2327,7 +2282,7 @@
           </mc:Choice>
           <mc:Fallback>
             <w:pict>
-              <v:shape w14:anchorId="3DC4D6D7" id="_x0000_s1036" type="#_x0000_t13" style="position:absolute;margin-left:357.85pt;margin-top:183.3pt;width:74.7pt;height:35.05pt;z-index:251783168;visibility:visible;mso-wrap-style:square;mso-height-percent:0;mso-wrap-distance-left:9pt;mso-wrap-distance-top:0;mso-wrap-distance-right:9pt;mso-wrap-distance-bottom:0;mso-position-horizontal:absolute;mso-position-horizontal-relative:text;mso-position-vertical:absolute;mso-position-vertical-relative:text;mso-height-percent:0;mso-height-relative:margin;v-text-anchor:middle" o:gfxdata="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" adj="16533" fillcolor="yellow" strokecolor="#030e13 [484]" strokeweight="1pt">
+              <v:shape w14:anchorId="3DC4D6D7" id="_x0000_s1037" type="#_x0000_t13" style="position:absolute;margin-left:357.85pt;margin-top:183.3pt;width:74.7pt;height:35.05pt;z-index:251782144;visibility:visible;mso-wrap-style:square;mso-height-percent:0;mso-wrap-distance-left:9pt;mso-wrap-distance-top:0;mso-wrap-distance-right:9pt;mso-wrap-distance-bottom:0;mso-position-horizontal:absolute;mso-position-horizontal-relative:text;mso-position-vertical:absolute;mso-position-vertical-relative:text;mso-height-percent:0;mso-height-relative:margin;v-text-anchor:middle" o:gfxdata="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" adj="16533" fillcolor="yellow" strokecolor="#030e13 [484]" strokeweight="1pt">
                 <v:textbox inset="0,0,0,0">
                   <w:txbxContent>
                     <w:p>
@@ -2358,7 +2313,7 @@
         <mc:AlternateContent>
           <mc:Choice Requires="wps">
             <w:drawing>
-              <wp:anchor distT="0" distB="0" distL="114300" distR="114300" simplePos="0" relativeHeight="251772928" behindDoc="0" locked="0" layoutInCell="1" allowOverlap="1" wp14:anchorId="3D0C7341" wp14:editId="6B908001">
+              <wp:anchor distT="0" distB="0" distL="114300" distR="114300" simplePos="0" relativeHeight="251771904" behindDoc="0" locked="0" layoutInCell="1" allowOverlap="1" wp14:anchorId="3D0C7341" wp14:editId="1348D605">
                 <wp:simplePos x="0" y="0"/>
                 <wp:positionH relativeFrom="column">
                   <wp:posOffset>4672690</wp:posOffset>
@@ -2446,7 +2401,7 @@
           </mc:Choice>
           <mc:Fallback>
             <w:pict>
-              <v:shape w14:anchorId="3D0C7341" id="_x0000_s1037" type="#_x0000_t62" style="position:absolute;margin-left:367.95pt;margin-top:277.3pt;width:124.9pt;height:40.5pt;z-index:251772928;visibility:visible;mso-wrap-style:square;mso-width-percent:0;mso-height-percent:0;mso-wrap-distance-left:9pt;mso-wrap-distance-top:0;mso-wrap-distance-right:9pt;mso-wrap-distance-bottom:0;mso-position-horizontal:absolute;mso-position-horizontal-relative:text;mso-position-vertical:absolute;mso-position-vertical-relative:text;mso-width-percent:0;mso-height-percent:0;mso-width-relative:margin;mso-height-relative:margin;v-text-anchor:middle" o:gfxdata="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" adj="-8402,-40863" fillcolor="#156082 [3204]" strokecolor="#030e13 [484]" strokeweight="1pt">
+              <v:shape w14:anchorId="3D0C7341" id="_x0000_s1038" type="#_x0000_t62" style="position:absolute;margin-left:367.95pt;margin-top:277.3pt;width:124.9pt;height:40.5pt;z-index:251771904;visibility:visible;mso-wrap-style:square;mso-width-percent:0;mso-height-percent:0;mso-wrap-distance-left:9pt;mso-wrap-distance-top:0;mso-wrap-distance-right:9pt;mso-wrap-distance-bottom:0;mso-position-horizontal:absolute;mso-position-horizontal-relative:text;mso-position-vertical:absolute;mso-position-vertical-relative:text;mso-width-percent:0;mso-height-percent:0;mso-width-relative:margin;mso-height-relative:margin;v-text-anchor:middle" o:gfxdata="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" adj="-8402,-40863" fillcolor="#156082 [3204]" strokecolor="#030e13 [484]" strokeweight="1pt">
                 <v:textbox inset="1mm,1mm,1mm,1mm">
                   <w:txbxContent>
                     <w:p>
@@ -2481,7 +2436,7 @@
         <mc:AlternateContent>
           <mc:Choice Requires="wps">
             <w:drawing>
-              <wp:anchor distT="0" distB="0" distL="114300" distR="114300" simplePos="0" relativeHeight="251780096" behindDoc="0" locked="0" layoutInCell="1" allowOverlap="1" wp14:anchorId="0C0A5BFE" wp14:editId="218BA226">
+              <wp:anchor distT="0" distB="0" distL="114300" distR="114300" simplePos="0" relativeHeight="251779072" behindDoc="0" locked="0" layoutInCell="1" allowOverlap="1" wp14:anchorId="0C0A5BFE" wp14:editId="01B7FA08">
                 <wp:simplePos x="0" y="0"/>
                 <wp:positionH relativeFrom="column">
                   <wp:posOffset>3814787</wp:posOffset>
@@ -2547,7 +2502,7 @@
           </mc:Choice>
           <mc:Fallback>
             <w:pict>
-              <v:shape w14:anchorId="0C0A5BFE" id="Text Box 5" o:spid="_x0000_s1038" type="#_x0000_t202" style="position:absolute;margin-left:300.4pt;margin-top:387.9pt;width:43.5pt;height:25.8pt;z-index:251780096;visibility:visible;mso-wrap-style:square;mso-width-percent:0;mso-wrap-distance-left:9pt;mso-wrap-distance-top:0;mso-wrap-distance-right:9pt;mso-wrap-distance-bottom:0;mso-position-horizontal:absolute;mso-position-horizontal-relative:text;mso-position-vertical:absolute;mso-position-vertical-relative:text;mso-width-percent:0;mso-width-relative:margin;v-text-anchor:top" o:gfxdata="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" filled="f" stroked="f" strokeweight=".5pt">
+              <v:shape w14:anchorId="0C0A5BFE" id="Text Box 5" o:spid="_x0000_s1039" type="#_x0000_t202" style="position:absolute;margin-left:300.4pt;margin-top:387.9pt;width:43.5pt;height:25.8pt;z-index:251779072;visibility:visible;mso-wrap-style:square;mso-width-percent:0;mso-wrap-distance-left:9pt;mso-wrap-distance-top:0;mso-wrap-distance-right:9pt;mso-wrap-distance-bottom:0;mso-position-horizontal:absolute;mso-position-horizontal-relative:text;mso-position-vertical:absolute;mso-position-vertical-relative:text;mso-width-percent:0;mso-width-relative:margin;v-text-anchor:top" o:gfxdata="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" filled="f" stroked="f" strokeweight=".5pt">
                 <v:textbox>
                   <w:txbxContent>
                     <w:p>
@@ -2579,7 +2534,7 @@
         <mc:AlternateContent>
           <mc:Choice Requires="wps">
             <w:drawing>
-              <wp:anchor distT="0" distB="0" distL="114300" distR="114300" simplePos="0" relativeHeight="251782144" behindDoc="0" locked="0" layoutInCell="1" allowOverlap="1" wp14:anchorId="6FD29F64" wp14:editId="04D841FB">
+              <wp:anchor distT="0" distB="0" distL="114300" distR="114300" simplePos="0" relativeHeight="251781120" behindDoc="0" locked="0" layoutInCell="1" allowOverlap="1" wp14:anchorId="6FD29F64" wp14:editId="09FFBF21">
                 <wp:simplePos x="0" y="0"/>
                 <wp:positionH relativeFrom="column">
                   <wp:posOffset>1161871</wp:posOffset>
@@ -2652,7 +2607,7 @@
           </mc:Choice>
           <mc:Fallback>
             <w:pict>
-              <v:shape w14:anchorId="6FD29F64" id="_x0000_s1039" type="#_x0000_t202" style="position:absolute;margin-left:91.5pt;margin-top:183.5pt;width:43.5pt;height:25.8pt;rotation:-90;z-index:251782144;visibility:visible;mso-wrap-style:square;mso-width-percent:0;mso-wrap-distance-left:9pt;mso-wrap-distance-top:0;mso-wrap-distance-right:9pt;mso-wrap-distance-bottom:0;mso-position-horizontal:absolute;mso-position-horizontal-relative:text;mso-position-vertical:absolute;mso-position-vertical-relative:text;mso-width-percent:0;mso-width-relative:margin;v-text-anchor:top" o:gfxdata="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" filled="f" stroked="f" strokeweight=".5pt">
+              <v:shape w14:anchorId="6FD29F64" id="_x0000_s1040" type="#_x0000_t202" style="position:absolute;margin-left:91.5pt;margin-top:183.5pt;width:43.5pt;height:25.8pt;rotation:-90;z-index:251781120;visibility:visible;mso-wrap-style:square;mso-width-percent:0;mso-wrap-distance-left:9pt;mso-wrap-distance-top:0;mso-wrap-distance-right:9pt;mso-wrap-distance-bottom:0;mso-position-horizontal:absolute;mso-position-horizontal-relative:text;mso-position-vertical:absolute;mso-position-vertical-relative:text;mso-width-percent:0;mso-width-relative:margin;v-text-anchor:top" o:gfxdata="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" filled="f" stroked="f" strokeweight=".5pt">
                 <v:textbox>
                   <w:txbxContent>
                     <w:p>
@@ -2691,7 +2646,7 @@
         <mc:AlternateContent>
           <mc:Choice Requires="wps">
             <w:drawing>
-              <wp:anchor distT="0" distB="0" distL="114300" distR="114300" simplePos="0" relativeHeight="251770880" behindDoc="0" locked="0" layoutInCell="1" allowOverlap="1" wp14:anchorId="059BA9E5" wp14:editId="7AAA3765">
+              <wp:anchor distT="0" distB="0" distL="114300" distR="114300" simplePos="0" relativeHeight="251769856" behindDoc="0" locked="0" layoutInCell="1" allowOverlap="1" wp14:anchorId="059BA9E5" wp14:editId="16032FAE">
                 <wp:simplePos x="0" y="0"/>
                 <wp:positionH relativeFrom="column">
                   <wp:posOffset>-306752</wp:posOffset>
@@ -2797,7 +2752,7 @@
           </mc:Choice>
           <mc:Fallback>
             <w:pict>
-              <v:shape w14:anchorId="059BA9E5" id="_x0000_s1040" type="#_x0000_t62" style="position:absolute;margin-left:-24.15pt;margin-top:279.6pt;width:124.9pt;height:79.25pt;z-index:251770880;visibility:visible;mso-wrap-style:square;mso-width-percent:0;mso-height-percent:0;mso-wrap-distance-left:9pt;mso-wrap-distance-top:0;mso-wrap-distance-right:9pt;mso-wrap-distance-bottom:0;mso-position-horizontal:absolute;mso-position-horizontal-relative:text;mso-position-vertical:absolute;mso-position-vertical-relative:text;mso-width-percent:0;mso-height-percent:0;mso-width-relative:margin;mso-height-relative:margin;v-text-anchor:middle" o:gfxdata="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" adj="27094,29729" fillcolor="#156082 [3204]" strokecolor="#030e13 [484]" strokeweight="1pt">
+              <v:shape w14:anchorId="059BA9E5" id="_x0000_s1041" type="#_x0000_t62" style="position:absolute;margin-left:-24.15pt;margin-top:279.6pt;width:124.9pt;height:79.25pt;z-index:251769856;visibility:visible;mso-wrap-style:square;mso-width-percent:0;mso-height-percent:0;mso-wrap-distance-left:9pt;mso-wrap-distance-top:0;mso-wrap-distance-right:9pt;mso-wrap-distance-bottom:0;mso-position-horizontal:absolute;mso-position-horizontal-relative:text;mso-position-vertical:absolute;mso-position-vertical-relative:text;mso-width-percent:0;mso-height-percent:0;mso-width-relative:margin;mso-height-relative:margin;v-text-anchor:middle" o:gfxdata="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" adj="27094,29729" fillcolor="#156082 [3204]" strokecolor="#030e13 [484]" strokeweight="1pt">
                 <v:textbox inset="1mm,1mm,1mm,1mm">
                   <w:txbxContent>
                     <w:p>
@@ -2850,7 +2805,7 @@
         <mc:AlternateContent>
           <mc:Choice Requires="wps">
             <w:drawing>
-              <wp:anchor distT="0" distB="0" distL="114300" distR="114300" simplePos="0" relativeHeight="251768832" behindDoc="0" locked="0" layoutInCell="1" allowOverlap="1" wp14:anchorId="560B75B9" wp14:editId="3E7EE318">
+              <wp:anchor distT="0" distB="0" distL="114300" distR="114300" simplePos="0" relativeHeight="251767808" behindDoc="0" locked="0" layoutInCell="1" allowOverlap="1" wp14:anchorId="560B75B9" wp14:editId="66C45BD0">
                 <wp:simplePos x="0" y="0"/>
                 <wp:positionH relativeFrom="column">
                   <wp:posOffset>6911492</wp:posOffset>
@@ -2956,7 +2911,7 @@
           </mc:Choice>
           <mc:Fallback>
             <w:pict>
-              <v:shape w14:anchorId="560B75B9" id="_x0000_s1041" type="#_x0000_t62" style="position:absolute;margin-left:544.2pt;margin-top:279.6pt;width:124.9pt;height:79.25pt;z-index:251768832;visibility:visible;mso-wrap-style:square;mso-width-percent:0;mso-height-percent:0;mso-wrap-distance-left:9pt;mso-wrap-distance-top:0;mso-wrap-distance-right:9pt;mso-wrap-distance-bottom:0;mso-position-horizontal:absolute;mso-position-horizontal-relative:text;mso-position-vertical:absolute;mso-position-vertical-relative:text;mso-width-percent:0;mso-height-percent:0;mso-width-relative:margin;mso-height-relative:margin;v-text-anchor:middle" o:gfxdata="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" adj="-6636,29730" fillcolor="#156082 [3204]" strokecolor="#030e13 [484]" strokeweight="1pt">
+              <v:shape w14:anchorId="560B75B9" id="_x0000_s1042" type="#_x0000_t62" style="position:absolute;margin-left:544.2pt;margin-top:279.6pt;width:124.9pt;height:79.25pt;z-index:251767808;visibility:visible;mso-wrap-style:square;mso-width-percent:0;mso-height-percent:0;mso-wrap-distance-left:9pt;mso-wrap-distance-top:0;mso-wrap-distance-right:9pt;mso-wrap-distance-bottom:0;mso-position-horizontal:absolute;mso-position-horizontal-relative:text;mso-position-vertical:absolute;mso-position-vertical-relative:text;mso-width-percent:0;mso-height-percent:0;mso-width-relative:margin;mso-height-relative:margin;v-text-anchor:middle" o:gfxdata="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" adj="-6636,29730" fillcolor="#156082 [3204]" strokecolor="#030e13 [484]" strokeweight="1pt">
                 <v:textbox inset="1mm,1mm,1mm,1mm">
                   <w:txbxContent>
                     <w:p>
@@ -3009,7 +2964,7 @@
         <mc:AlternateContent>
           <mc:Choice Requires="wps">
             <w:drawing>
-              <wp:anchor distT="0" distB="0" distL="114300" distR="114300" simplePos="0" relativeHeight="251766784" behindDoc="0" locked="0" layoutInCell="1" allowOverlap="1" wp14:anchorId="3C866BB5" wp14:editId="6037D825">
+              <wp:anchor distT="0" distB="0" distL="114300" distR="114300" simplePos="0" relativeHeight="251765760" behindDoc="0" locked="0" layoutInCell="1" allowOverlap="1" wp14:anchorId="3C866BB5" wp14:editId="512A81DA">
                 <wp:simplePos x="0" y="0"/>
                 <wp:positionH relativeFrom="column">
                   <wp:posOffset>6906089</wp:posOffset>
@@ -3115,7 +3070,7 @@
           </mc:Choice>
           <mc:Fallback>
             <w:pict>
-              <v:shape w14:anchorId="3C866BB5" id="_x0000_s1042" type="#_x0000_t62" style="position:absolute;margin-left:543.8pt;margin-top:46.2pt;width:124.9pt;height:79.25pt;z-index:251766784;visibility:visible;mso-wrap-style:square;mso-width-percent:0;mso-height-percent:0;mso-wrap-distance-left:9pt;mso-wrap-distance-top:0;mso-wrap-distance-right:9pt;mso-wrap-distance-bottom:0;mso-position-horizontal:absolute;mso-position-horizontal-relative:text;mso-position-vertical:absolute;mso-position-vertical-relative:text;mso-width-percent:0;mso-height-percent:0;mso-width-relative:margin;mso-height-relative:margin;v-text-anchor:middle" o:gfxdata="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" adj="-6637,-7908" fillcolor="#156082 [3204]" strokecolor="#030e13 [484]" strokeweight="1pt">
+              <v:shape w14:anchorId="3C866BB5" id="_x0000_s1043" type="#_x0000_t62" style="position:absolute;margin-left:543.8pt;margin-top:46.2pt;width:124.9pt;height:79.25pt;z-index:251765760;visibility:visible;mso-wrap-style:square;mso-width-percent:0;mso-height-percent:0;mso-wrap-distance-left:9pt;mso-wrap-distance-top:0;mso-wrap-distance-right:9pt;mso-wrap-distance-bottom:0;mso-position-horizontal:absolute;mso-position-horizontal-relative:text;mso-position-vertical:absolute;mso-position-vertical-relative:text;mso-width-percent:0;mso-height-percent:0;mso-width-relative:margin;mso-height-relative:margin;v-text-anchor:middle" o:gfxdata="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" adj="-6637,-7908" fillcolor="#156082 [3204]" strokecolor="#030e13 [484]" strokeweight="1pt">
                 <v:textbox inset="1mm,1mm,1mm,1mm">
                   <w:txbxContent>
                     <w:p>
@@ -3168,7 +3123,7 @@
         <mc:AlternateContent>
           <mc:Choice Requires="wps">
             <w:drawing>
-              <wp:anchor distT="0" distB="0" distL="114300" distR="114300" simplePos="0" relativeHeight="251764736" behindDoc="0" locked="0" layoutInCell="1" allowOverlap="1" wp14:anchorId="036A3DD1" wp14:editId="71F5D979">
+              <wp:anchor distT="0" distB="0" distL="114300" distR="114300" simplePos="0" relativeHeight="251763712" behindDoc="0" locked="0" layoutInCell="1" allowOverlap="1" wp14:anchorId="036A3DD1" wp14:editId="1A51DA25">
                 <wp:simplePos x="0" y="0"/>
                 <wp:positionH relativeFrom="column">
                   <wp:posOffset>-306752</wp:posOffset>
@@ -3298,7 +3253,7 @@
           </mc:Choice>
           <mc:Fallback>
             <w:pict>
-              <v:shape w14:anchorId="036A3DD1" id="_x0000_s1043" type="#_x0000_t62" style="position:absolute;margin-left:-24.15pt;margin-top:53.05pt;width:124.9pt;height:79.25pt;z-index:251764736;visibility:visible;mso-wrap-style:square;mso-width-percent:0;mso-height-percent:0;mso-wrap-distance-left:9pt;mso-wrap-distance-top:0;mso-wrap-distance-right:9pt;mso-wrap-distance-bottom:0;mso-position-horizontal:absolute;mso-position-horizontal-relative:text;mso-position-vertical:absolute;mso-position-vertical-relative:text;mso-width-percent:0;mso-height-percent:0;mso-width-relative:margin;mso-height-relative:margin;v-text-anchor:middle" o:gfxdata="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" adj="27280,-9958" fillcolor="#156082 [3204]" strokecolor="#030e13 [484]" strokeweight="1pt">
+              <v:shape w14:anchorId="036A3DD1" id="_x0000_s1044" type="#_x0000_t62" style="position:absolute;margin-left:-24.15pt;margin-top:53.05pt;width:124.9pt;height:79.25pt;z-index:251763712;visibility:visible;mso-wrap-style:square;mso-width-percent:0;mso-height-percent:0;mso-wrap-distance-left:9pt;mso-wrap-distance-top:0;mso-wrap-distance-right:9pt;mso-wrap-distance-bottom:0;mso-position-horizontal:absolute;mso-position-horizontal-relative:text;mso-position-vertical:absolute;mso-position-vertical-relative:text;mso-width-percent:0;mso-height-percent:0;mso-width-relative:margin;mso-height-relative:margin;v-text-anchor:middle" o:gfxdata="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" adj="27280,-9958" fillcolor="#156082 [3204]" strokecolor="#030e13 [484]" strokeweight="1pt">
                 <v:textbox inset="1mm,1mm,1mm,1mm">
                   <w:txbxContent>
                     <w:p>
@@ -3728,7 +3683,7 @@
                 <w:lang w:eastAsia="nl-NL"/>
               </w:rPr>
               <w:drawing>
-                <wp:anchor distT="0" distB="0" distL="114300" distR="114300" simplePos="0" relativeHeight="251705344" behindDoc="0" locked="0" layoutInCell="1" allowOverlap="1" wp14:anchorId="7C9A140E" wp14:editId="6C5A2626">
+                <wp:anchor distT="0" distB="0" distL="114300" distR="114300" simplePos="0" relativeHeight="251704320" behindDoc="0" locked="0" layoutInCell="1" allowOverlap="1" wp14:anchorId="7C9A140E" wp14:editId="58940C91">
                   <wp:simplePos x="0" y="0"/>
                   <wp:positionH relativeFrom="column">
                     <wp:posOffset>224267</wp:posOffset>
@@ -3817,7 +3772,7 @@
           <w:noProof/>
         </w:rPr>
         <w:drawing>
-          <wp:anchor distT="0" distB="0" distL="114300" distR="114300" simplePos="0" relativeHeight="251820032" behindDoc="0" locked="0" layoutInCell="1" allowOverlap="1" wp14:anchorId="4AD85700" wp14:editId="1AFD9DEA">
+          <wp:anchor distT="0" distB="0" distL="114300" distR="114300" simplePos="0" relativeHeight="251819008" behindDoc="0" locked="0" layoutInCell="1" allowOverlap="1" wp14:anchorId="4AD85700" wp14:editId="40E2FC7E">
             <wp:simplePos x="0" y="0"/>
             <wp:positionH relativeFrom="column">
               <wp:posOffset>4070985</wp:posOffset>
@@ -3940,7 +3895,7 @@
           <w:noProof/>
         </w:rPr>
         <w:drawing>
-          <wp:anchor distT="0" distB="0" distL="114300" distR="114300" simplePos="0" relativeHeight="251821056" behindDoc="0" locked="0" layoutInCell="1" allowOverlap="1" wp14:anchorId="3A369B4F" wp14:editId="2D0207D1">
+          <wp:anchor distT="0" distB="0" distL="114300" distR="114300" simplePos="0" relativeHeight="251820032" behindDoc="0" locked="0" layoutInCell="1" allowOverlap="1" wp14:anchorId="3A369B4F" wp14:editId="5EFD400B">
             <wp:simplePos x="0" y="0"/>
             <wp:positionH relativeFrom="column">
               <wp:posOffset>2718435</wp:posOffset>
@@ -4122,7 +4077,7 @@
         <mc:AlternateContent>
           <mc:Choice Requires="wps">
             <w:drawing>
-              <wp:anchor distT="0" distB="0" distL="114300" distR="114300" simplePos="0" relativeHeight="251824128" behindDoc="0" locked="0" layoutInCell="1" allowOverlap="1" wp14:anchorId="77CEDC81" wp14:editId="52DAB53E">
+              <wp:anchor distT="0" distB="0" distL="114300" distR="114300" simplePos="0" relativeHeight="251823104" behindDoc="0" locked="0" layoutInCell="1" allowOverlap="1" wp14:anchorId="77CEDC81" wp14:editId="65EBE92F">
                 <wp:simplePos x="0" y="0"/>
                 <wp:positionH relativeFrom="column">
                   <wp:posOffset>832485</wp:posOffset>
@@ -4180,11 +4135,7 @@
           </mc:Choice>
           <mc:Fallback>
             <w:pict>
-              <v:shapetype w14:anchorId="7F3B3FEC" id="_x0000_t32" coordsize="21600,21600" o:spt="32" o:oned="t" path="m,l21600,21600e" filled="f">
-                <v:path arrowok="t" fillok="f" o:connecttype="none"/>
-                <o:lock v:ext="edit" shapetype="t"/>
-              </v:shapetype>
-              <v:shape id="Straight Arrow Connector 33" o:spid="_x0000_s1026" type="#_x0000_t32" style="position:absolute;margin-left:65.55pt;margin-top:77.7pt;width:151.5pt;height:4.5pt;flip:x y;z-index:251824128;visibility:visible;mso-wrap-style:square;mso-width-percent:0;mso-height-percent:0;mso-wrap-distance-left:9pt;mso-wrap-distance-top:0;mso-wrap-distance-right:9pt;mso-wrap-distance-bottom:0;mso-position-horizontal:absolute;mso-position-horizontal-relative:text;mso-position-vertical:absolute;mso-position-vertical-relative:text;mso-width-percent:0;mso-height-percent:0;mso-width-relative:margin;mso-height-relative:margin" o:gfxdata="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" strokecolor="#156082 [3204]" strokeweight="3pt">
+              <v:shape w14:anchorId="6FE01A4C" id="Straight Arrow Connector 33" o:spid="_x0000_s1026" type="#_x0000_t32" style="position:absolute;margin-left:65.55pt;margin-top:77.7pt;width:151.5pt;height:4.5pt;flip:x y;z-index:251823104;visibility:visible;mso-wrap-style:square;mso-width-percent:0;mso-height-percent:0;mso-wrap-distance-left:9pt;mso-wrap-distance-top:0;mso-wrap-distance-right:9pt;mso-wrap-distance-bottom:0;mso-position-horizontal:absolute;mso-position-horizontal-relative:text;mso-position-vertical:absolute;mso-position-vertical-relative:text;mso-width-percent:0;mso-height-percent:0;mso-width-relative:margin;mso-height-relative:margin" o:gfxdata="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" strokecolor="#156082 [3204]" strokeweight="3pt">
                 <v:stroke endarrow="block" joinstyle="miter"/>
               </v:shape>
             </w:pict>
@@ -4200,7 +4151,7 @@
         <mc:AlternateContent>
           <mc:Choice Requires="wps">
             <w:drawing>
-              <wp:anchor distT="0" distB="0" distL="114300" distR="114300" simplePos="0" relativeHeight="251822080" behindDoc="0" locked="0" layoutInCell="1" allowOverlap="1" wp14:anchorId="63BC4F52" wp14:editId="71FF47E7">
+              <wp:anchor distT="0" distB="0" distL="114300" distR="114300" simplePos="0" relativeHeight="251821056" behindDoc="0" locked="0" layoutInCell="1" allowOverlap="1" wp14:anchorId="63BC4F52" wp14:editId="348ED0C5">
                 <wp:simplePos x="0" y="0"/>
                 <wp:positionH relativeFrom="column">
                   <wp:posOffset>1003934</wp:posOffset>
@@ -4258,7 +4209,7 @@
           </mc:Choice>
           <mc:Fallback>
             <w:pict>
-              <v:shape w14:anchorId="164795EC" id="Straight Arrow Connector 33" o:spid="_x0000_s1026" type="#_x0000_t32" style="position:absolute;margin-left:79.05pt;margin-top:91.2pt;width:151.5pt;height:4.5pt;flip:x y;z-index:251822080;visibility:visible;mso-wrap-style:square;mso-width-percent:0;mso-height-percent:0;mso-wrap-distance-left:9pt;mso-wrap-distance-top:0;mso-wrap-distance-right:9pt;mso-wrap-distance-bottom:0;mso-position-horizontal:absolute;mso-position-horizontal-relative:text;mso-position-vertical:absolute;mso-position-vertical-relative:text;mso-width-percent:0;mso-height-percent:0;mso-width-relative:margin;mso-height-relative:margin" o:gfxdata="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" strokecolor="#156082 [3204]" strokeweight="3pt">
+              <v:shape w14:anchorId="74667953" id="Straight Arrow Connector 33" o:spid="_x0000_s1026" type="#_x0000_t32" style="position:absolute;margin-left:79.05pt;margin-top:91.2pt;width:151.5pt;height:4.5pt;flip:x y;z-index:251821056;visibility:visible;mso-wrap-style:square;mso-width-percent:0;mso-height-percent:0;mso-wrap-distance-left:9pt;mso-wrap-distance-top:0;mso-wrap-distance-right:9pt;mso-wrap-distance-bottom:0;mso-position-horizontal:absolute;mso-position-horizontal-relative:text;mso-position-vertical:absolute;mso-position-vertical-relative:text;mso-width-percent:0;mso-height-percent:0;mso-width-relative:margin;mso-height-relative:margin" o:gfxdata="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" strokecolor="#156082 [3204]" strokeweight="3pt">
                 <v:stroke endarrow="block" joinstyle="miter"/>
               </v:shape>
             </w:pict>
@@ -5544,13 +5495,7 @@
               <w:ind w:left="58"/>
             </w:pPr>
             <w:r>
-              <w:t xml:space="preserve">Zet de opdracht voor Satijnsteek </w:t>
-            </w:r>
-            <w:r>
-              <w:t xml:space="preserve">er </w:t>
-            </w:r>
-            <w:r>
-              <w:t>nog boven</w:t>
+              <w:t>Zet de opdracht voor Satijnsteek er nog boven</w:t>
             </w:r>
           </w:p>
           <w:p>
@@ -6435,7 +6380,7 @@
                 <w:lang w:eastAsia="nl-NL"/>
               </w:rPr>
               <w:drawing>
-                <wp:anchor distT="0" distB="0" distL="114300" distR="114300" simplePos="0" relativeHeight="251740160" behindDoc="0" locked="0" layoutInCell="1" allowOverlap="1" wp14:anchorId="4E72FA86" wp14:editId="2E3E1C77">
+                <wp:anchor distT="0" distB="0" distL="114300" distR="114300" simplePos="0" relativeHeight="251739136" behindDoc="0" locked="0" layoutInCell="1" allowOverlap="1" wp14:anchorId="4E72FA86" wp14:editId="42B2FAB5">
                   <wp:simplePos x="0" y="0"/>
                   <wp:positionH relativeFrom="column">
                     <wp:posOffset>162817</wp:posOffset>
@@ -6809,7 +6754,7 @@
                 <w:lang w:eastAsia="nl-NL"/>
               </w:rPr>
               <w:drawing>
-                <wp:anchor distT="0" distB="0" distL="114300" distR="114300" simplePos="0" relativeHeight="251826176" behindDoc="0" locked="0" layoutInCell="1" allowOverlap="1" wp14:anchorId="7A11FCD9" wp14:editId="1F1DFCF5">
+                <wp:anchor distT="0" distB="0" distL="114300" distR="114300" simplePos="0" relativeHeight="251825152" behindDoc="0" locked="0" layoutInCell="1" allowOverlap="1" wp14:anchorId="7A11FCD9" wp14:editId="265DA530">
                   <wp:simplePos x="0" y="0"/>
                   <wp:positionH relativeFrom="column">
                     <wp:posOffset>-6350</wp:posOffset>
@@ -7410,7 +7355,7 @@
               <mc:AlternateContent>
                 <mc:Choice Requires="wps">
                   <w:drawing>
-                    <wp:anchor distT="0" distB="0" distL="114300" distR="114300" simplePos="0" relativeHeight="251813888" behindDoc="0" locked="0" layoutInCell="1" allowOverlap="1" wp14:anchorId="6A6585FE" wp14:editId="3A5E601B">
+                    <wp:anchor distT="0" distB="0" distL="114300" distR="114300" simplePos="0" relativeHeight="251812864" behindDoc="0" locked="0" layoutInCell="1" allowOverlap="1" wp14:anchorId="6A6585FE" wp14:editId="3E0B4FA8">
                       <wp:simplePos x="0" y="0"/>
                       <wp:positionH relativeFrom="column">
                         <wp:posOffset>1712216</wp:posOffset>
@@ -7471,7 +7416,7 @@
                 </mc:Choice>
                 <mc:Fallback>
                   <w:pict>
-                    <v:shape w14:anchorId="4759019C" id="Straight Arrow Connector 13" o:spid="_x0000_s1026" type="#_x0000_t32" style="position:absolute;margin-left:134.8pt;margin-top:48.2pt;width:54.7pt;height:13.45pt;flip:x y;z-index:251813888;visibility:visible;mso-wrap-style:square;mso-width-percent:0;mso-height-percent:0;mso-wrap-distance-left:9pt;mso-wrap-distance-top:0;mso-wrap-distance-right:9pt;mso-wrap-distance-bottom:0;mso-position-horizontal:absolute;mso-position-horizontal-relative:text;mso-position-vertical:absolute;mso-position-vertical-relative:text;mso-width-percent:0;mso-height-percent:0;mso-width-relative:page;mso-height-relative:page" o:gfxdata="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" strokecolor="red" strokeweight="4pt">
+                    <v:shape w14:anchorId="432666C1" id="Straight Arrow Connector 13" o:spid="_x0000_s1026" type="#_x0000_t32" style="position:absolute;margin-left:134.8pt;margin-top:48.2pt;width:54.7pt;height:13.45pt;flip:x y;z-index:251812864;visibility:visible;mso-wrap-style:square;mso-width-percent:0;mso-height-percent:0;mso-wrap-distance-left:9pt;mso-wrap-distance-top:0;mso-wrap-distance-right:9pt;mso-wrap-distance-bottom:0;mso-position-horizontal:absolute;mso-position-horizontal-relative:text;mso-position-vertical:absolute;mso-position-vertical-relative:text;mso-width-percent:0;mso-height-percent:0;mso-width-relative:page;mso-height-relative:page" o:gfxdata="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" strokecolor="red" strokeweight="4pt">
                       <v:stroke endarrow="block"/>
                     </v:shape>
                   </w:pict>
@@ -7487,7 +7432,7 @@
               <mc:AlternateContent>
                 <mc:Choice Requires="wpg">
                   <w:drawing>
-                    <wp:anchor distT="0" distB="0" distL="114300" distR="114300" simplePos="0" relativeHeight="251811840" behindDoc="0" locked="0" layoutInCell="1" allowOverlap="1" wp14:anchorId="24E34BBE" wp14:editId="55D9550E">
+                    <wp:anchor distT="0" distB="0" distL="114300" distR="114300" simplePos="0" relativeHeight="251810816" behindDoc="0" locked="0" layoutInCell="1" allowOverlap="1" wp14:anchorId="24E34BBE" wp14:editId="2516BD43">
                       <wp:simplePos x="0" y="0"/>
                       <wp:positionH relativeFrom="column">
                         <wp:posOffset>2056130</wp:posOffset>
@@ -7637,11 +7582,11 @@
                 </mc:Choice>
                 <mc:Fallback>
                   <w:pict>
-                    <v:group w14:anchorId="24E34BBE" id="Group 14" o:spid="_x0000_s1044" style="position:absolute;margin-left:161.9pt;margin-top:101.6pt;width:26.9pt;height:30.1pt;z-index:251811840" coordorigin="1429,719" coordsize="538,602" o:gfxdata="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">
-                      <v:oval id="Oval 16" o:spid="_x0000_s1045" style="position:absolute;left:1429;top:763;width:516;height:516;visibility:visible;mso-wrap-style:square;v-text-anchor:top" o:gfxdata="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" fillcolor="#156082 [3204]" strokecolor="#f2f2f2 [3041]" strokeweight="3pt">
+                    <v:group w14:anchorId="24E34BBE" id="Group 14" o:spid="_x0000_s1045" style="position:absolute;margin-left:161.9pt;margin-top:101.6pt;width:26.9pt;height:30.1pt;z-index:251810816" coordorigin="1429,719" coordsize="538,602" o:gfxdata="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">
+                      <v:oval id="Oval 16" o:spid="_x0000_s1046" style="position:absolute;left:1429;top:763;width:516;height:516;visibility:visible;mso-wrap-style:square;v-text-anchor:top" o:gfxdata="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" fillcolor="#156082 [3204]" strokecolor="#f2f2f2 [3041]" strokeweight="3pt">
                         <v:shadow on="t" color="#0a2f40 [1604]" opacity=".5" offset="1pt"/>
                       </v:oval>
-                      <v:shape id="Text Box 17" o:spid="_x0000_s1046" type="#_x0000_t202" style="position:absolute;left:1473;top:719;width:494;height:602;visibility:visible;mso-wrap-style:square;v-text-anchor:top" o:gfxdata="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" filled="f" stroked="f">
+                      <v:shape id="Text Box 17" o:spid="_x0000_s1047" type="#_x0000_t202" style="position:absolute;left:1473;top:719;width:494;height:602;visibility:visible;mso-wrap-style:square;v-text-anchor:top" o:gfxdata="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" filled="f" stroked="f">
                         <v:textbox>
                           <w:txbxContent>
                             <w:p>
@@ -7679,7 +7624,7 @@
               <mc:AlternateContent>
                 <mc:Choice Requires="wps">
                   <w:drawing>
-                    <wp:anchor distT="0" distB="0" distL="114300" distR="114300" simplePos="0" relativeHeight="251809792" behindDoc="0" locked="0" layoutInCell="1" allowOverlap="1" wp14:anchorId="3C28787A" wp14:editId="412B570B">
+                    <wp:anchor distT="0" distB="0" distL="114300" distR="114300" simplePos="0" relativeHeight="251808768" behindDoc="0" locked="0" layoutInCell="1" allowOverlap="1" wp14:anchorId="3C28787A" wp14:editId="44F326D6">
                       <wp:simplePos x="0" y="0"/>
                       <wp:positionH relativeFrom="column">
                         <wp:posOffset>1222317</wp:posOffset>
@@ -7740,7 +7685,7 @@
                 </mc:Choice>
                 <mc:Fallback>
                   <w:pict>
-                    <v:shape w14:anchorId="10B871BB" id="Straight Arrow Connector 13" o:spid="_x0000_s1026" type="#_x0000_t32" style="position:absolute;margin-left:96.25pt;margin-top:119.3pt;width:57.6pt;height:3.6pt;flip:x;z-index:251809792;visibility:visible;mso-wrap-style:square;mso-width-percent:0;mso-height-percent:0;mso-wrap-distance-left:9pt;mso-wrap-distance-top:0;mso-wrap-distance-right:9pt;mso-wrap-distance-bottom:0;mso-position-horizontal:absolute;mso-position-horizontal-relative:text;mso-position-vertical:absolute;mso-position-vertical-relative:text;mso-width-percent:0;mso-height-percent:0;mso-width-relative:page;mso-height-relative:page" o:gfxdata="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" strokecolor="red" strokeweight="4pt">
+                    <v:shape w14:anchorId="0C644CB2" id="Straight Arrow Connector 13" o:spid="_x0000_s1026" type="#_x0000_t32" style="position:absolute;margin-left:96.25pt;margin-top:119.3pt;width:57.6pt;height:3.6pt;flip:x;z-index:251808768;visibility:visible;mso-wrap-style:square;mso-width-percent:0;mso-height-percent:0;mso-wrap-distance-left:9pt;mso-wrap-distance-top:0;mso-wrap-distance-right:9pt;mso-wrap-distance-bottom:0;mso-position-horizontal:absolute;mso-position-horizontal-relative:text;mso-position-vertical:absolute;mso-position-vertical-relative:text;mso-width-percent:0;mso-height-percent:0;mso-width-relative:page;mso-height-relative:page" o:gfxdata="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" strokecolor="red" strokeweight="4pt">
                       <v:stroke endarrow="block"/>
                     </v:shape>
                   </w:pict>
@@ -7756,7 +7701,7 @@
               <mc:AlternateContent>
                 <mc:Choice Requires="wpg">
                   <w:drawing>
-                    <wp:anchor distT="0" distB="0" distL="114300" distR="114300" simplePos="0" relativeHeight="251810816" behindDoc="0" locked="0" layoutInCell="1" allowOverlap="1" wp14:anchorId="0BA7B71D" wp14:editId="504CC6D8">
+                    <wp:anchor distT="0" distB="0" distL="114300" distR="114300" simplePos="0" relativeHeight="251809792" behindDoc="0" locked="0" layoutInCell="1" allowOverlap="1" wp14:anchorId="0BA7B71D" wp14:editId="3F25B828">
                       <wp:simplePos x="0" y="0"/>
                       <wp:positionH relativeFrom="column">
                         <wp:posOffset>2516334</wp:posOffset>
@@ -7906,11 +7851,11 @@
                 </mc:Choice>
                 <mc:Fallback>
                   <w:pict>
-                    <v:group w14:anchorId="0BA7B71D" id="_x0000_s1047" style="position:absolute;margin-left:198.15pt;margin-top:48.1pt;width:26.9pt;height:30.1pt;z-index:251810816" coordorigin="1429,719" coordsize="538,602" o:gfxdata="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">
-                      <v:oval id="Oval 16" o:spid="_x0000_s1048" style="position:absolute;left:1429;top:763;width:516;height:516;visibility:visible;mso-wrap-style:square;v-text-anchor:top" o:gfxdata="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" fillcolor="#156082 [3204]" strokecolor="#f2f2f2 [3041]" strokeweight="3pt">
+                    <v:group w14:anchorId="0BA7B71D" id="_x0000_s1048" style="position:absolute;margin-left:198.15pt;margin-top:48.1pt;width:26.9pt;height:30.1pt;z-index:251809792" coordorigin="1429,719" coordsize="538,602" o:gfxdata="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">
+                      <v:oval id="Oval 16" o:spid="_x0000_s1049" style="position:absolute;left:1429;top:763;width:516;height:516;visibility:visible;mso-wrap-style:square;v-text-anchor:top" o:gfxdata="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" fillcolor="#156082 [3204]" strokecolor="#f2f2f2 [3041]" strokeweight="3pt">
                         <v:shadow on="t" color="#0a2f40 [1604]" opacity=".5" offset="1pt"/>
                       </v:oval>
-                      <v:shape id="Text Box 17" o:spid="_x0000_s1049" type="#_x0000_t202" style="position:absolute;left:1473;top:719;width:494;height:602;visibility:visible;mso-wrap-style:square;v-text-anchor:top" o:gfxdata="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" filled="f" stroked="f">
+                      <v:shape id="Text Box 17" o:spid="_x0000_s1050" type="#_x0000_t202" style="position:absolute;left:1473;top:719;width:494;height:602;visibility:visible;mso-wrap-style:square;v-text-anchor:top" o:gfxdata="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" filled="f" stroked="f">
                         <v:textbox>
                           <w:txbxContent>
                             <w:p>
@@ -8006,7 +7951,7 @@
               <mc:AlternateContent>
                 <mc:Choice Requires="wps">
                   <w:drawing>
-                    <wp:anchor distT="0" distB="0" distL="114300" distR="114300" simplePos="0" relativeHeight="251816960" behindDoc="0" locked="0" layoutInCell="1" allowOverlap="1" wp14:anchorId="7BC858F1" wp14:editId="037815DD">
+                    <wp:anchor distT="0" distB="0" distL="114300" distR="114300" simplePos="0" relativeHeight="251815936" behindDoc="0" locked="0" layoutInCell="1" allowOverlap="1" wp14:anchorId="7BC858F1" wp14:editId="6F705EC0">
                       <wp:simplePos x="0" y="0"/>
                       <wp:positionH relativeFrom="column">
                         <wp:posOffset>1039495</wp:posOffset>
@@ -8067,7 +8012,7 @@
                 </mc:Choice>
                 <mc:Fallback>
                   <w:pict>
-                    <v:shape w14:anchorId="2642B6C4" id="Straight Arrow Connector 13" o:spid="_x0000_s1026" type="#_x0000_t32" style="position:absolute;margin-left:81.85pt;margin-top:99.8pt;width:163.75pt;height:10.85pt;flip:x y;z-index:251816960;visibility:visible;mso-wrap-style:square;mso-width-percent:0;mso-height-percent:0;mso-wrap-distance-left:9pt;mso-wrap-distance-top:0;mso-wrap-distance-right:9pt;mso-wrap-distance-bottom:0;mso-position-horizontal:absolute;mso-position-horizontal-relative:text;mso-position-vertical:absolute;mso-position-vertical-relative:text;mso-width-percent:0;mso-height-percent:0;mso-width-relative:page;mso-height-relative:page" o:gfxdata="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" strokecolor="red" strokeweight="4pt">
+                    <v:shape w14:anchorId="0EFD25C1" id="Straight Arrow Connector 13" o:spid="_x0000_s1026" type="#_x0000_t32" style="position:absolute;margin-left:81.85pt;margin-top:99.8pt;width:163.75pt;height:10.85pt;flip:x y;z-index:251815936;visibility:visible;mso-wrap-style:square;mso-width-percent:0;mso-height-percent:0;mso-wrap-distance-left:9pt;mso-wrap-distance-top:0;mso-wrap-distance-right:9pt;mso-wrap-distance-bottom:0;mso-position-horizontal:absolute;mso-position-horizontal-relative:text;mso-position-vertical:absolute;mso-position-vertical-relative:text;mso-width-percent:0;mso-height-percent:0;mso-width-relative:page;mso-height-relative:page" o:gfxdata="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" strokecolor="red" strokeweight="4pt">
                       <v:stroke endarrow="block"/>
                     </v:shape>
                   </w:pict>
@@ -8083,7 +8028,7 @@
               <mc:AlternateContent>
                 <mc:Choice Requires="wpg">
                   <w:drawing>
-                    <wp:anchor distT="0" distB="0" distL="114300" distR="114300" simplePos="0" relativeHeight="251815936" behindDoc="0" locked="0" layoutInCell="1" allowOverlap="1" wp14:anchorId="5D840476" wp14:editId="6797EF5F">
+                    <wp:anchor distT="0" distB="0" distL="114300" distR="114300" simplePos="0" relativeHeight="251814912" behindDoc="0" locked="0" layoutInCell="1" allowOverlap="1" wp14:anchorId="5D840476" wp14:editId="20441899">
                       <wp:simplePos x="0" y="0"/>
                       <wp:positionH relativeFrom="column">
                         <wp:posOffset>3221023</wp:posOffset>
@@ -8233,11 +8178,11 @@
                 </mc:Choice>
                 <mc:Fallback>
                   <w:pict>
-                    <v:group w14:anchorId="5D840476" id="_x0000_s1050" style="position:absolute;margin-left:253.6pt;margin-top:86.6pt;width:26.9pt;height:30.1pt;z-index:251815936" coordorigin="1429,719" coordsize="538,602" o:gfxdata="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">
-                      <v:oval id="Oval 16" o:spid="_x0000_s1051" style="position:absolute;left:1429;top:763;width:516;height:516;visibility:visible;mso-wrap-style:square;v-text-anchor:top" o:gfxdata="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" fillcolor="#156082 [3204]" strokecolor="#f2f2f2 [3041]" strokeweight="3pt">
+                    <v:group w14:anchorId="5D840476" id="_x0000_s1051" style="position:absolute;margin-left:253.6pt;margin-top:86.6pt;width:26.9pt;height:30.1pt;z-index:251814912" coordorigin="1429,719" coordsize="538,602" o:gfxdata="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">
+                      <v:oval id="Oval 16" o:spid="_x0000_s1052" style="position:absolute;left:1429;top:763;width:516;height:516;visibility:visible;mso-wrap-style:square;v-text-anchor:top" o:gfxdata="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" fillcolor="#156082 [3204]" strokecolor="#f2f2f2 [3041]" strokeweight="3pt">
                         <v:shadow on="t" color="#0a2f40 [1604]" opacity=".5" offset="1pt"/>
                       </v:oval>
-                      <v:shape id="Text Box 17" o:spid="_x0000_s1052" type="#_x0000_t202" style="position:absolute;left:1473;top:719;width:494;height:602;visibility:visible;mso-wrap-style:square;v-text-anchor:top" o:gfxdata="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" filled="f" stroked="f">
+                      <v:shape id="Text Box 17" o:spid="_x0000_s1053" type="#_x0000_t202" style="position:absolute;left:1473;top:719;width:494;height:602;visibility:visible;mso-wrap-style:square;v-text-anchor:top" o:gfxdata="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" filled="f" stroked="f">
                         <v:textbox>
                           <w:txbxContent>
                             <w:p>
@@ -8275,7 +8220,7 @@
               <mc:AlternateContent>
                 <mc:Choice Requires="wps">
                   <w:drawing>
-                    <wp:anchor distT="0" distB="0" distL="114300" distR="114300" simplePos="0" relativeHeight="251814912" behindDoc="0" locked="0" layoutInCell="1" allowOverlap="1" wp14:anchorId="16E348A7" wp14:editId="26E1D452">
+                    <wp:anchor distT="0" distB="0" distL="114300" distR="114300" simplePos="0" relativeHeight="251813888" behindDoc="0" locked="0" layoutInCell="1" allowOverlap="1" wp14:anchorId="16E348A7" wp14:editId="52FBC868">
                       <wp:simplePos x="0" y="0"/>
                       <wp:positionH relativeFrom="column">
                         <wp:posOffset>1220896</wp:posOffset>
@@ -8336,7 +8281,7 @@
                 </mc:Choice>
                 <mc:Fallback>
                   <w:pict>
-                    <v:shape w14:anchorId="3C615501" id="Straight Arrow Connector 13" o:spid="_x0000_s1026" type="#_x0000_t32" style="position:absolute;margin-left:96.15pt;margin-top:43.45pt;width:149.5pt;height:3.6pt;flip:x;z-index:251814912;visibility:visible;mso-wrap-style:square;mso-width-percent:0;mso-height-percent:0;mso-wrap-distance-left:9pt;mso-wrap-distance-top:0;mso-wrap-distance-right:9pt;mso-wrap-distance-bottom:0;mso-position-horizontal:absolute;mso-position-horizontal-relative:text;mso-position-vertical:absolute;mso-position-vertical-relative:text;mso-width-percent:0;mso-height-percent:0;mso-width-relative:page;mso-height-relative:page" o:gfxdata="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" strokecolor="red" strokeweight="4pt">
+                    <v:shape w14:anchorId="7ED49831" id="Straight Arrow Connector 13" o:spid="_x0000_s1026" type="#_x0000_t32" style="position:absolute;margin-left:96.15pt;margin-top:43.45pt;width:149.5pt;height:3.6pt;flip:x;z-index:251813888;visibility:visible;mso-wrap-style:square;mso-width-percent:0;mso-height-percent:0;mso-wrap-distance-left:9pt;mso-wrap-distance-top:0;mso-wrap-distance-right:9pt;mso-wrap-distance-bottom:0;mso-position-horizontal:absolute;mso-position-horizontal-relative:text;mso-position-vertical:absolute;mso-position-vertical-relative:text;mso-width-percent:0;mso-height-percent:0;mso-width-relative:page;mso-height-relative:page" o:gfxdata="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" strokecolor="red" strokeweight="4pt">
                       <v:stroke endarrow="block"/>
                     </v:shape>
                   </w:pict>
@@ -8352,7 +8297,7 @@
               <mc:AlternateContent>
                 <mc:Choice Requires="wpg">
                   <w:drawing>
-                    <wp:anchor distT="0" distB="0" distL="114300" distR="114300" simplePos="0" relativeHeight="251812864" behindDoc="0" locked="0" layoutInCell="1" allowOverlap="1" wp14:anchorId="35F80845" wp14:editId="08C9E4F8">
+                    <wp:anchor distT="0" distB="0" distL="114300" distR="114300" simplePos="0" relativeHeight="251811840" behindDoc="0" locked="0" layoutInCell="1" allowOverlap="1" wp14:anchorId="35F80845" wp14:editId="746767F0">
                       <wp:simplePos x="0" y="0"/>
                       <wp:positionH relativeFrom="column">
                         <wp:posOffset>3234993</wp:posOffset>
@@ -8502,11 +8447,11 @@
                 </mc:Choice>
                 <mc:Fallback>
                   <w:pict>
-                    <v:group w14:anchorId="35F80845" id="_x0000_s1053" style="position:absolute;margin-left:254.7pt;margin-top:28.1pt;width:26.9pt;height:30.1pt;z-index:251812864" coordorigin="1429,719" coordsize="538,602" o:gfxdata="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">
-                      <v:oval id="Oval 16" o:spid="_x0000_s1054" style="position:absolute;left:1429;top:763;width:516;height:516;visibility:visible;mso-wrap-style:square;v-text-anchor:top" o:gfxdata="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" fillcolor="#156082 [3204]" strokecolor="#f2f2f2 [3041]" strokeweight="3pt">
+                    <v:group w14:anchorId="35F80845" id="_x0000_s1054" style="position:absolute;margin-left:254.7pt;margin-top:28.1pt;width:26.9pt;height:30.1pt;z-index:251811840" coordorigin="1429,719" coordsize="538,602" o:gfxdata="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">
+                      <v:oval id="Oval 16" o:spid="_x0000_s1055" style="position:absolute;left:1429;top:763;width:516;height:516;visibility:visible;mso-wrap-style:square;v-text-anchor:top" o:gfxdata="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" fillcolor="#156082 [3204]" strokecolor="#f2f2f2 [3041]" strokeweight="3pt">
                         <v:shadow on="t" color="#0a2f40 [1604]" opacity=".5" offset="1pt"/>
                       </v:oval>
-                      <v:shape id="Text Box 17" o:spid="_x0000_s1055" type="#_x0000_t202" style="position:absolute;left:1473;top:719;width:494;height:602;visibility:visible;mso-wrap-style:square;v-text-anchor:top" o:gfxdata="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" filled="f" stroked="f">
+                      <v:shape id="Text Box 17" o:spid="_x0000_s1056" type="#_x0000_t202" style="position:absolute;left:1473;top:719;width:494;height:602;visibility:visible;mso-wrap-style:square;v-text-anchor:top" o:gfxdata="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" filled="f" stroked="f">
                         <v:textbox>
                           <w:txbxContent>
                             <w:p>
@@ -10246,15 +10191,15 @@
         <mc:AlternateContent>
           <mc:Choice Requires="wps">
             <w:drawing>
-              <wp:anchor distT="0" distB="0" distL="114300" distR="114300" simplePos="0" relativeHeight="251828224" behindDoc="0" locked="0" layoutInCell="1" allowOverlap="1" wp14:anchorId="0B49F6EA" wp14:editId="7AB41B07">
+              <wp:anchor distT="0" distB="0" distL="114300" distR="114300" simplePos="0" relativeHeight="251827200" behindDoc="0" locked="0" layoutInCell="1" allowOverlap="1" wp14:anchorId="0B49F6EA" wp14:editId="25474588">
                 <wp:simplePos x="0" y="0"/>
                 <wp:positionH relativeFrom="column">
                   <wp:posOffset>7138035</wp:posOffset>
                 </wp:positionH>
                 <wp:positionV relativeFrom="paragraph">
-                  <wp:posOffset>114935</wp:posOffset>
+                  <wp:posOffset>105410</wp:posOffset>
                 </wp:positionV>
-                <wp:extent cx="2152650" cy="1238250"/>
+                <wp:extent cx="2152650" cy="990600"/>
                 <wp:effectExtent l="0" t="0" r="19050" b="19050"/>
                 <wp:wrapNone/>
                 <wp:docPr id="1271832628" name="Text Box 34"/>
@@ -10266,7 +10211,7 @@
                       <wps:spPr>
                         <a:xfrm>
                           <a:off x="0" y="0"/>
-                          <a:ext cx="2152650" cy="1238250"/>
+                          <a:ext cx="2152650" cy="990600"/>
                         </a:xfrm>
                         <a:prstGeom prst="rect">
                           <a:avLst/>
@@ -10284,10 +10229,7 @@
                         <w:txbxContent>
                           <w:p>
                             <w:r>
-                              <w:t>Z</w:t>
-                            </w:r>
-                            <w:r>
-                              <w:t xml:space="preserve">oek je een borduurmachine om het echt te kunnen maken? Vraag je </w:t>
+                              <w:t xml:space="preserve">Zoek je een borduurmachine om het echt te kunnen maken? Vraag je </w:t>
                             </w:r>
                             <w:proofErr w:type="spellStart"/>
                             <w:r>
@@ -10310,24 +10252,20 @@
                     </wps:wsp>
                   </a:graphicData>
                 </a:graphic>
+                <wp14:sizeRelV relativeFrom="margin">
+                  <wp14:pctHeight>0</wp14:pctHeight>
+                </wp14:sizeRelV>
               </wp:anchor>
             </w:drawing>
           </mc:Choice>
           <mc:Fallback>
             <w:pict>
-              <v:shapetype w14:anchorId="0B49F6EA" id="_x0000_t202" coordsize="21600,21600" o:spt="202" path="m,l,21600r21600,l21600,xe">
-                <v:stroke joinstyle="miter"/>
-                <v:path gradientshapeok="t" o:connecttype="rect"/>
-              </v:shapetype>
-              <v:shape id="Text Box 34" o:spid="_x0000_s1057" type="#_x0000_t202" style="position:absolute;margin-left:562.05pt;margin-top:9.05pt;width:169.5pt;height:97.5pt;z-index:251828224;visibility:visible;mso-wrap-style:square;mso-wrap-distance-left:9pt;mso-wrap-distance-top:0;mso-wrap-distance-right:9pt;mso-wrap-distance-bottom:0;mso-position-horizontal:absolute;mso-position-horizontal-relative:text;mso-position-vertical:absolute;mso-position-vertical-relative:text;v-text-anchor:top" o:gfxdata="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" fillcolor="white [3201]" strokeweight=".5pt">
+              <v:shape w14:anchorId="0B49F6EA" id="Text Box 34" o:spid="_x0000_s1057" type="#_x0000_t202" style="position:absolute;margin-left:562.05pt;margin-top:8.3pt;width:169.5pt;height:78pt;z-index:251827200;visibility:visible;mso-wrap-style:square;mso-height-percent:0;mso-wrap-distance-left:9pt;mso-wrap-distance-top:0;mso-wrap-distance-right:9pt;mso-wrap-distance-bottom:0;mso-position-horizontal:absolute;mso-position-horizontal-relative:text;mso-position-vertical:absolute;mso-position-vertical-relative:text;mso-height-percent:0;mso-height-relative:margin;v-text-anchor:top" o:gfxdata="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" fillcolor="white [3201]" strokeweight=".5pt">
                 <v:textbox>
                   <w:txbxContent>
                     <w:p>
                       <w:r>
-                        <w:t>Z</w:t>
-                      </w:r>
-                      <w:r>
-                        <w:t xml:space="preserve">oek je een borduurmachine om het echt te kunnen maken? Vraag je </w:t>
+                        <w:t xml:space="preserve">Zoek je een borduurmachine om het echt te kunnen maken? Vraag je </w:t>
                       </w:r>
                       <w:proofErr w:type="spellStart"/>
                       <w:r>
@@ -10395,9 +10333,69 @@
         </w:numPr>
       </w:pPr>
       <w:r>
+        <w:rPr>
+          <w:noProof/>
+        </w:rPr>
+        <w:drawing>
+          <wp:anchor distT="0" distB="0" distL="114300" distR="114300" simplePos="0" relativeHeight="251829248" behindDoc="0" locked="0" layoutInCell="1" allowOverlap="1" wp14:anchorId="77D4EABC" wp14:editId="3A434594">
+            <wp:simplePos x="0" y="0"/>
+            <wp:positionH relativeFrom="column">
+              <wp:posOffset>7138035</wp:posOffset>
+            </wp:positionH>
+            <wp:positionV relativeFrom="paragraph">
+              <wp:posOffset>38100</wp:posOffset>
+            </wp:positionV>
+            <wp:extent cx="1210310" cy="1192315"/>
+            <wp:effectExtent l="0" t="0" r="8890" b="8255"/>
+            <wp:wrapNone/>
+            <wp:docPr id="1693512324" name="Picture 1"/>
+            <wp:cNvGraphicFramePr>
+              <a:graphicFrameLocks xmlns:a="http://schemas.openxmlformats.org/drawingml/2006/main" noChangeAspect="1"/>
+            </wp:cNvGraphicFramePr>
+            <a:graphic xmlns:a="http://schemas.openxmlformats.org/drawingml/2006/main">
+              <a:graphicData uri="http://schemas.openxmlformats.org/drawingml/2006/picture">
+                <pic:pic xmlns:pic="http://schemas.openxmlformats.org/drawingml/2006/picture">
+                  <pic:nvPicPr>
+                    <pic:cNvPr id="1693512324" name=""/>
+                    <pic:cNvPicPr/>
+                  </pic:nvPicPr>
+                  <pic:blipFill>
+                    <a:blip r:embed="rId42" cstate="print">
+                      <a:extLst>
+                        <a:ext uri="{28A0092B-C50C-407E-A947-70E740481C1C}">
+                          <a14:useLocalDpi xmlns:a14="http://schemas.microsoft.com/office/drawing/2010/main" val="0"/>
+                        </a:ext>
+                      </a:extLst>
+                    </a:blip>
+                    <a:stretch>
+                      <a:fillRect/>
+                    </a:stretch>
+                  </pic:blipFill>
+                  <pic:spPr>
+                    <a:xfrm>
+                      <a:off x="0" y="0"/>
+                      <a:ext cx="1210310" cy="1192315"/>
+                    </a:xfrm>
+                    <a:prstGeom prst="rect">
+                      <a:avLst/>
+                    </a:prstGeom>
+                  </pic:spPr>
+                </pic:pic>
+              </a:graphicData>
+            </a:graphic>
+            <wp14:sizeRelH relativeFrom="page">
+              <wp14:pctWidth>0</wp14:pctWidth>
+            </wp14:sizeRelH>
+            <wp14:sizeRelV relativeFrom="page">
+              <wp14:pctHeight>0</wp14:pctHeight>
+            </wp14:sizeRelV>
+          </wp:anchor>
+        </w:drawing>
+      </w:r>
+      <w:r>
         <w:t xml:space="preserve">Ga naar </w:t>
       </w:r>
-      <w:hyperlink r:id="rId42" w:history="1">
+      <w:hyperlink r:id="rId43" w:history="1">
         <w:r>
           <w:rPr>
             <w:rStyle w:val="Hyperlink"/>
@@ -10415,72 +10413,17 @@
         </w:numPr>
       </w:pPr>
       <w:r>
-        <w:t xml:space="preserve">Klik op </w:t>
-      </w:r>
-      <w:r>
+        <w:rPr>
+          <w:noProof/>
+        </w:rPr>
         <w:drawing>
-          <wp:inline distT="0" distB="0" distL="0" distR="0" wp14:anchorId="0FCE4798" wp14:editId="6F6E417A">
-            <wp:extent cx="1066800" cy="561975"/>
-            <wp:effectExtent l="0" t="0" r="0" b="9525"/>
-            <wp:docPr id="2125817836" name="Picture 1"/>
-            <wp:cNvGraphicFramePr>
-              <a:graphicFrameLocks xmlns:a="http://schemas.openxmlformats.org/drawingml/2006/main" noChangeAspect="1"/>
-            </wp:cNvGraphicFramePr>
-            <a:graphic xmlns:a="http://schemas.openxmlformats.org/drawingml/2006/main">
-              <a:graphicData uri="http://schemas.openxmlformats.org/drawingml/2006/picture">
-                <pic:pic xmlns:pic="http://schemas.openxmlformats.org/drawingml/2006/picture">
-                  <pic:nvPicPr>
-                    <pic:cNvPr id="2125817836" name=""/>
-                    <pic:cNvPicPr/>
-                  </pic:nvPicPr>
-                  <pic:blipFill rotWithShape="1">
-                    <a:blip r:embed="rId43"/>
-                    <a:srcRect b="26250"/>
-                    <a:stretch>
-                      <a:fillRect/>
-                    </a:stretch>
-                  </pic:blipFill>
-                  <pic:spPr bwMode="auto">
-                    <a:xfrm>
-                      <a:off x="0" y="0"/>
-                      <a:ext cx="1066949" cy="562053"/>
-                    </a:xfrm>
-                    <a:prstGeom prst="rect">
-                      <a:avLst/>
-                    </a:prstGeom>
-                    <a:ln>
-                      <a:noFill/>
-                    </a:ln>
-                    <a:extLst>
-                      <a:ext uri="{53640926-AAD7-44D8-BBD7-CCE9431645EC}">
-                        <a14:shadowObscured xmlns:a14="http://schemas.microsoft.com/office/drawing/2010/main"/>
-                      </a:ext>
-                    </a:extLst>
-                  </pic:spPr>
-                </pic:pic>
-              </a:graphicData>
-            </a:graphic>
-          </wp:inline>
-        </w:drawing>
-      </w:r>
-    </w:p>
-    <w:p>
-      <w:pPr>
-        <w:pStyle w:val="ListParagraph"/>
-        <w:numPr>
-          <w:ilvl w:val="0"/>
-          <w:numId w:val="8"/>
-        </w:numPr>
-      </w:pPr>
-      <w:r>
-        <w:drawing>
-          <wp:anchor distT="0" distB="0" distL="114300" distR="114300" simplePos="0" relativeHeight="251827200" behindDoc="0" locked="0" layoutInCell="1" allowOverlap="1" wp14:anchorId="03F6F30E" wp14:editId="6D75EF36">
+          <wp:anchor distT="0" distB="0" distL="114300" distR="114300" simplePos="0" relativeHeight="251826176" behindDoc="0" locked="0" layoutInCell="1" allowOverlap="1" wp14:anchorId="03F6F30E" wp14:editId="3C4A42FE">
             <wp:simplePos x="0" y="0"/>
             <wp:positionH relativeFrom="column">
-              <wp:posOffset>4023360</wp:posOffset>
+              <wp:posOffset>3737610</wp:posOffset>
             </wp:positionH>
             <wp:positionV relativeFrom="paragraph">
-              <wp:posOffset>882015</wp:posOffset>
+              <wp:posOffset>647065</wp:posOffset>
             </wp:positionV>
             <wp:extent cx="1292225" cy="1714500"/>
             <wp:effectExtent l="0" t="0" r="3175" b="0"/>
@@ -10539,13 +10482,331 @@
         </w:drawing>
       </w:r>
       <w:r>
+        <w:t xml:space="preserve">Klik op </w:t>
+      </w:r>
+      <w:r>
+        <w:rPr>
+          <w:noProof/>
+        </w:rPr>
+        <w:drawing>
+          <wp:inline distT="0" distB="0" distL="0" distR="0" wp14:anchorId="0FCE4798" wp14:editId="07F8E324">
+            <wp:extent cx="1066800" cy="561975"/>
+            <wp:effectExtent l="0" t="0" r="0" b="9525"/>
+            <wp:docPr id="2125817836" name="Picture 1"/>
+            <wp:cNvGraphicFramePr>
+              <a:graphicFrameLocks xmlns:a="http://schemas.openxmlformats.org/drawingml/2006/main" noChangeAspect="1"/>
+            </wp:cNvGraphicFramePr>
+            <a:graphic xmlns:a="http://schemas.openxmlformats.org/drawingml/2006/main">
+              <a:graphicData uri="http://schemas.openxmlformats.org/drawingml/2006/picture">
+                <pic:pic xmlns:pic="http://schemas.openxmlformats.org/drawingml/2006/picture">
+                  <pic:nvPicPr>
+                    <pic:cNvPr id="2125817836" name=""/>
+                    <pic:cNvPicPr/>
+                  </pic:nvPicPr>
+                  <pic:blipFill rotWithShape="1">
+                    <a:blip r:embed="rId45"/>
+                    <a:srcRect b="26250"/>
+                    <a:stretch>
+                      <a:fillRect/>
+                    </a:stretch>
+                  </pic:blipFill>
+                  <pic:spPr bwMode="auto">
+                    <a:xfrm>
+                      <a:off x="0" y="0"/>
+                      <a:ext cx="1066949" cy="562053"/>
+                    </a:xfrm>
+                    <a:prstGeom prst="rect">
+                      <a:avLst/>
+                    </a:prstGeom>
+                    <a:ln>
+                      <a:noFill/>
+                    </a:ln>
+                    <a:extLst>
+                      <a:ext uri="{53640926-AAD7-44D8-BBD7-CCE9431645EC}">
+                        <a14:shadowObscured xmlns:a14="http://schemas.microsoft.com/office/drawing/2010/main"/>
+                      </a:ext>
+                    </a:extLst>
+                  </pic:spPr>
+                </pic:pic>
+              </a:graphicData>
+            </a:graphic>
+          </wp:inline>
+        </w:drawing>
+      </w:r>
+    </w:p>
+    <w:p>
+      <w:pPr>
+        <w:pStyle w:val="ListParagraph"/>
+        <w:numPr>
+          <w:ilvl w:val="0"/>
+          <w:numId w:val="8"/>
+        </w:numPr>
+      </w:pPr>
+      <w:r>
+        <w:rPr>
+          <w:b/>
+          <w:bCs/>
+          <w:noProof/>
+        </w:rPr>
+        <mc:AlternateContent>
+          <mc:Choice Requires="wpg">
+            <w:drawing>
+              <wp:anchor distT="0" distB="0" distL="114300" distR="114300" simplePos="0" relativeHeight="251839488" behindDoc="0" locked="0" layoutInCell="1" allowOverlap="1" wp14:anchorId="380A48FA" wp14:editId="01B8B012">
+                <wp:simplePos x="0" y="0"/>
+                <wp:positionH relativeFrom="column">
+                  <wp:posOffset>7138035</wp:posOffset>
+                </wp:positionH>
+                <wp:positionV relativeFrom="paragraph">
+                  <wp:posOffset>1487170</wp:posOffset>
+                </wp:positionV>
+                <wp:extent cx="2152650" cy="1847850"/>
+                <wp:effectExtent l="0" t="0" r="19050" b="19050"/>
+                <wp:wrapNone/>
+                <wp:docPr id="1441564298" name="Group 39"/>
+                <wp:cNvGraphicFramePr/>
+                <a:graphic xmlns:a="http://schemas.openxmlformats.org/drawingml/2006/main">
+                  <a:graphicData uri="http://schemas.microsoft.com/office/word/2010/wordprocessingGroup">
+                    <wpg:wgp>
+                      <wpg:cNvGrpSpPr/>
+                      <wpg:grpSpPr>
+                        <a:xfrm>
+                          <a:off x="0" y="0"/>
+                          <a:ext cx="2152650" cy="1847850"/>
+                          <a:chOff x="0" y="0"/>
+                          <a:chExt cx="2152650" cy="1847850"/>
+                        </a:xfrm>
+                      </wpg:grpSpPr>
+                      <wps:wsp>
+                        <wps:cNvPr id="1923438005" name="Text Box 38"/>
+                        <wps:cNvSpPr txBox="1"/>
+                        <wps:spPr>
+                          <a:xfrm>
+                            <a:off x="0" y="0"/>
+                            <a:ext cx="2152650" cy="1847850"/>
+                          </a:xfrm>
+                          <a:prstGeom prst="rect">
+                            <a:avLst/>
+                          </a:prstGeom>
+                          <a:solidFill>
+                            <a:schemeClr val="lt1"/>
+                          </a:solidFill>
+                          <a:ln w="6350">
+                            <a:solidFill>
+                              <a:prstClr val="black"/>
+                            </a:solidFill>
+                          </a:ln>
+                        </wps:spPr>
+                        <wps:txbx>
+                          <w:txbxContent>
+                            <w:p>
+                              <w:r>
+                                <w:t>Downloaden van de leerlingenhandleiding? Klik hier:</w:t>
+                              </w:r>
+                            </w:p>
+                          </w:txbxContent>
+                        </wps:txbx>
+                        <wps:bodyPr rot="0" spcFirstLastPara="0" vertOverflow="overflow" horzOverflow="overflow" vert="horz" wrap="square" lIns="91440" tIns="45720" rIns="91440" bIns="45720" numCol="1" spcCol="0" rtlCol="0" fromWordArt="0" anchor="t" anchorCtr="0" forceAA="0" compatLnSpc="1">
+                          <a:prstTxWarp prst="textNoShape">
+                            <a:avLst/>
+                          </a:prstTxWarp>
+                          <a:noAutofit/>
+                        </wps:bodyPr>
+                      </wps:wsp>
+                      <pic:pic xmlns:pic="http://schemas.openxmlformats.org/drawingml/2006/picture">
+                        <pic:nvPicPr>
+                          <pic:cNvPr id="24628381" name="Picture 1"/>
+                          <pic:cNvPicPr>
+                            <a:picLocks noChangeAspect="1"/>
+                          </pic:cNvPicPr>
+                        </pic:nvPicPr>
+                        <pic:blipFill>
+                          <a:blip r:embed="rId46">
+                            <a:extLst>
+                              <a:ext uri="{28A0092B-C50C-407E-A947-70E740481C1C}">
+                                <a14:useLocalDpi xmlns:a14="http://schemas.microsoft.com/office/drawing/2010/main" val="0"/>
+                              </a:ext>
+                            </a:extLst>
+                          </a:blip>
+                          <a:stretch>
+                            <a:fillRect/>
+                          </a:stretch>
+                        </pic:blipFill>
+                        <pic:spPr>
+                          <a:xfrm>
+                            <a:off x="257175" y="1095375"/>
+                            <a:ext cx="1228725" cy="590550"/>
+                          </a:xfrm>
+                          <a:prstGeom prst="rect">
+                            <a:avLst/>
+                          </a:prstGeom>
+                        </pic:spPr>
+                      </pic:pic>
+                      <wps:wsp>
+                        <wps:cNvPr id="1150240631" name="Straight Arrow Connector 33"/>
+                        <wps:cNvCnPr/>
+                        <wps:spPr>
+                          <a:xfrm>
+                            <a:off x="485775" y="552450"/>
+                            <a:ext cx="95250" cy="723900"/>
+                          </a:xfrm>
+                          <a:prstGeom prst="straightConnector1">
+                            <a:avLst/>
+                          </a:prstGeom>
+                          <a:ln w="38100">
+                            <a:tailEnd type="triangle"/>
+                          </a:ln>
+                        </wps:spPr>
+                        <wps:style>
+                          <a:lnRef idx="1">
+                            <a:schemeClr val="accent1"/>
+                          </a:lnRef>
+                          <a:fillRef idx="0">
+                            <a:schemeClr val="accent1"/>
+                          </a:fillRef>
+                          <a:effectRef idx="0">
+                            <a:schemeClr val="accent1"/>
+                          </a:effectRef>
+                          <a:fontRef idx="minor">
+                            <a:schemeClr val="tx1"/>
+                          </a:fontRef>
+                        </wps:style>
+                        <wps:bodyPr/>
+                      </wps:wsp>
+                    </wpg:wgp>
+                  </a:graphicData>
+                </a:graphic>
+              </wp:anchor>
+            </w:drawing>
+          </mc:Choice>
+          <mc:Fallback>
+            <w:pict>
+              <v:group w14:anchorId="380A48FA" id="Group 39" o:spid="_x0000_s1058" style="position:absolute;left:0;text-align:left;margin-left:562.05pt;margin-top:117.1pt;width:169.5pt;height:145.5pt;z-index:251839488" coordsize="21526,18478" o:gfxdata="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">
+                <v:shape id="Text Box 38" o:spid="_x0000_s1059" type="#_x0000_t202" style="position:absolute;width:21526;height:18478;visibility:visible;mso-wrap-style:square;v-text-anchor:top" o:gfxdata="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" fillcolor="white [3201]" strokeweight=".5pt">
+                  <v:textbox>
+                    <w:txbxContent>
+                      <w:p>
+                        <w:r>
+                          <w:t>Downloaden van de leerlingenhandleiding? Klik hier:</w:t>
+                        </w:r>
+                      </w:p>
+                    </w:txbxContent>
+                  </v:textbox>
+                </v:shape>
+                <v:shapetype id="_x0000_t75" coordsize="21600,21600" o:spt="75" o:preferrelative="t" path="m@4@5l@4@11@9@11@9@5xe" filled="f" stroked="f">
+                  <v:stroke joinstyle="miter"/>
+                  <v:formulas>
+                    <v:f eqn="if lineDrawn pixelLineWidth 0"/>
+                    <v:f eqn="sum @0 1 0"/>
+                    <v:f eqn="sum 0 0 @1"/>
+                    <v:f eqn="prod @2 1 2"/>
+                    <v:f eqn="prod @3 21600 pixelWidth"/>
+                    <v:f eqn="prod @3 21600 pixelHeight"/>
+                    <v:f eqn="sum @0 0 1"/>
+                    <v:f eqn="prod @6 1 2"/>
+                    <v:f eqn="prod @7 21600 pixelWidth"/>
+                    <v:f eqn="sum @8 21600 0"/>
+                    <v:f eqn="prod @7 21600 pixelHeight"/>
+                    <v:f eqn="sum @10 21600 0"/>
+                  </v:formulas>
+                  <v:path o:extrusionok="f" gradientshapeok="t" o:connecttype="rect"/>
+                  <o:lock v:ext="edit" aspectratio="t"/>
+                </v:shapetype>
+                <v:shape id="Picture 1" o:spid="_x0000_s1060" type="#_x0000_t75" style="position:absolute;left:2571;top:10953;width:12288;height:5906;visibility:visible;mso-wrap-style:square" o:gfxdata="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">
+                  <v:imagedata r:id="rId47" o:title=""/>
+                </v:shape>
+                <v:shape id="Straight Arrow Connector 33" o:spid="_x0000_s1061" type="#_x0000_t32" style="position:absolute;left:4857;top:5524;width:953;height:7239;visibility:visible;mso-wrap-style:square" o:connectortype="straight" o:gfxdata="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" strokecolor="#156082 [3204]" strokeweight="3pt">
+                  <v:stroke endarrow="block" joinstyle="miter"/>
+                </v:shape>
+              </v:group>
+            </w:pict>
+          </mc:Fallback>
+        </mc:AlternateContent>
+      </w:r>
+      <w:r>
+        <w:rPr>
+          <w:b/>
+          <w:bCs/>
+          <w:noProof/>
+        </w:rPr>
+        <mc:AlternateContent>
+          <mc:Choice Requires="wps">
+            <w:drawing>
+              <wp:anchor distT="0" distB="0" distL="114300" distR="114300" simplePos="0" relativeHeight="251834368" behindDoc="0" locked="0" layoutInCell="1" allowOverlap="1" wp14:anchorId="71BB7F04" wp14:editId="61D71923">
+                <wp:simplePos x="0" y="0"/>
+                <wp:positionH relativeFrom="column">
+                  <wp:posOffset>641985</wp:posOffset>
+                </wp:positionH>
+                <wp:positionV relativeFrom="paragraph">
+                  <wp:posOffset>934720</wp:posOffset>
+                </wp:positionV>
+                <wp:extent cx="723900" cy="57150"/>
+                <wp:effectExtent l="19050" t="95250" r="0" b="57150"/>
+                <wp:wrapNone/>
+                <wp:docPr id="1297382225" name="Straight Arrow Connector 33"/>
+                <wp:cNvGraphicFramePr/>
+                <a:graphic xmlns:a="http://schemas.openxmlformats.org/drawingml/2006/main">
+                  <a:graphicData uri="http://schemas.microsoft.com/office/word/2010/wordprocessingShape">
+                    <wps:wsp>
+                      <wps:cNvCnPr/>
+                      <wps:spPr>
+                        <a:xfrm flipV="1">
+                          <a:off x="0" y="0"/>
+                          <a:ext cx="723900" cy="57150"/>
+                        </a:xfrm>
+                        <a:prstGeom prst="straightConnector1">
+                          <a:avLst/>
+                        </a:prstGeom>
+                        <a:ln w="38100">
+                          <a:tailEnd type="triangle"/>
+                        </a:ln>
+                      </wps:spPr>
+                      <wps:style>
+                        <a:lnRef idx="1">
+                          <a:schemeClr val="accent1"/>
+                        </a:lnRef>
+                        <a:fillRef idx="0">
+                          <a:schemeClr val="accent1"/>
+                        </a:fillRef>
+                        <a:effectRef idx="0">
+                          <a:schemeClr val="accent1"/>
+                        </a:effectRef>
+                        <a:fontRef idx="minor">
+                          <a:schemeClr val="tx1"/>
+                        </a:fontRef>
+                      </wps:style>
+                      <wps:bodyPr/>
+                    </wps:wsp>
+                  </a:graphicData>
+                </a:graphic>
+                <wp14:sizeRelH relativeFrom="margin">
+                  <wp14:pctWidth>0</wp14:pctWidth>
+                </wp14:sizeRelH>
+                <wp14:sizeRelV relativeFrom="margin">
+                  <wp14:pctHeight>0</wp14:pctHeight>
+                </wp14:sizeRelV>
+              </wp:anchor>
+            </w:drawing>
+          </mc:Choice>
+          <mc:Fallback>
+            <w:pict>
+              <v:shape w14:anchorId="41BDB2DB" id="Straight Arrow Connector 33" o:spid="_x0000_s1026" type="#_x0000_t32" style="position:absolute;margin-left:50.55pt;margin-top:73.6pt;width:57pt;height:4.5pt;flip:y;z-index:251834368;visibility:visible;mso-wrap-style:square;mso-width-percent:0;mso-height-percent:0;mso-wrap-distance-left:9pt;mso-wrap-distance-top:0;mso-wrap-distance-right:9pt;mso-wrap-distance-bottom:0;mso-position-horizontal:absolute;mso-position-horizontal-relative:text;mso-position-vertical:absolute;mso-position-vertical-relative:text;mso-width-percent:0;mso-height-percent:0;mso-width-relative:margin;mso-height-relative:margin" o:gfxdata="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" strokecolor="#156082 [3204]" strokeweight="3pt">
+                <v:stroke endarrow="block" joinstyle="miter"/>
+              </v:shape>
+            </w:pict>
+          </mc:Fallback>
+        </mc:AlternateContent>
+      </w:r>
+      <w:r>
         <w:t xml:space="preserve">Stel de taal in: </w:t>
       </w:r>
       <w:r>
+        <w:rPr>
+          <w:noProof/>
+        </w:rPr>
         <w:drawing>
-          <wp:inline distT="0" distB="0" distL="0" distR="0" wp14:anchorId="025C2D96" wp14:editId="254D81A6">
-            <wp:extent cx="1590897" cy="2695951"/>
-            <wp:effectExtent l="0" t="0" r="9525" b="9525"/>
+          <wp:inline distT="0" distB="0" distL="0" distR="0" wp14:anchorId="025C2D96" wp14:editId="13EC34FA">
+            <wp:extent cx="1590675" cy="1771650"/>
+            <wp:effectExtent l="0" t="0" r="9525" b="0"/>
             <wp:docPr id="2001676347" name="Picture 1"/>
             <wp:cNvGraphicFramePr>
               <a:graphicFrameLocks xmlns:a="http://schemas.openxmlformats.org/drawingml/2006/main" noChangeAspect="1"/>
@@ -10557,16 +10818,211 @@
                     <pic:cNvPr id="2001676347" name=""/>
                     <pic:cNvPicPr/>
                   </pic:nvPicPr>
+                  <pic:blipFill rotWithShape="1">
+                    <a:blip r:embed="rId48"/>
+                    <a:srcRect b="34275"/>
+                    <a:stretch>
+                      <a:fillRect/>
+                    </a:stretch>
+                  </pic:blipFill>
+                  <pic:spPr bwMode="auto">
+                    <a:xfrm>
+                      <a:off x="0" y="0"/>
+                      <a:ext cx="1590897" cy="1771897"/>
+                    </a:xfrm>
+                    <a:prstGeom prst="rect">
+                      <a:avLst/>
+                    </a:prstGeom>
+                    <a:ln>
+                      <a:noFill/>
+                    </a:ln>
+                    <a:extLst>
+                      <a:ext uri="{53640926-AAD7-44D8-BBD7-CCE9431645EC}">
+                        <a14:shadowObscured xmlns:a14="http://schemas.microsoft.com/office/drawing/2010/main"/>
+                      </a:ext>
+                    </a:extLst>
+                  </pic:spPr>
+                </pic:pic>
+              </a:graphicData>
+            </a:graphic>
+          </wp:inline>
+        </w:drawing>
+      </w:r>
+      <w:r>
+        <w:rPr>
+          <w:noProof/>
+        </w:rPr>
+        <w:t xml:space="preserve"> </w:t>
+      </w:r>
+    </w:p>
+    <w:p>
+      <w:pPr>
+        <w:pStyle w:val="ListParagraph"/>
+        <w:numPr>
+          <w:ilvl w:val="0"/>
+          <w:numId w:val="8"/>
+        </w:numPr>
+      </w:pPr>
+      <w:r>
+        <w:rPr>
+          <w:noProof/>
+        </w:rPr>
+        <w:t>En begin te programmeren</w:t>
+      </w:r>
+      <w:r>
+        <w:rPr>
+          <w:noProof/>
+        </w:rPr>
+        <w:t>!</w:t>
+      </w:r>
+    </w:p>
+    <w:p>
+      <w:r>
+        <w:rPr>
+          <w:noProof/>
+        </w:rPr>
+        <mc:AlternateContent>
+          <mc:Choice Requires="wps">
+            <w:drawing>
+              <wp:anchor distT="0" distB="0" distL="114300" distR="114300" simplePos="0" relativeHeight="251835392" behindDoc="0" locked="0" layoutInCell="1" allowOverlap="1" wp14:anchorId="12E3BBDA" wp14:editId="67B90574">
+                <wp:simplePos x="0" y="0"/>
+                <wp:positionH relativeFrom="column">
+                  <wp:posOffset>232410</wp:posOffset>
+                </wp:positionH>
+                <wp:positionV relativeFrom="paragraph">
+                  <wp:posOffset>34290</wp:posOffset>
+                </wp:positionV>
+                <wp:extent cx="4683125" cy="1095375"/>
+                <wp:effectExtent l="0" t="0" r="22225" b="28575"/>
+                <wp:wrapNone/>
+                <wp:docPr id="1404224860" name="Text Box 37"/>
+                <wp:cNvGraphicFramePr/>
+                <a:graphic xmlns:a="http://schemas.openxmlformats.org/drawingml/2006/main">
+                  <a:graphicData uri="http://schemas.microsoft.com/office/word/2010/wordprocessingShape">
+                    <wps:wsp>
+                      <wps:cNvSpPr txBox="1"/>
+                      <wps:spPr>
+                        <a:xfrm>
+                          <a:off x="0" y="0"/>
+                          <a:ext cx="4683125" cy="1095375"/>
+                        </a:xfrm>
+                        <a:prstGeom prst="rect">
+                          <a:avLst/>
+                        </a:prstGeom>
+                        <a:solidFill>
+                          <a:schemeClr val="lt1"/>
+                        </a:solidFill>
+                        <a:ln w="6350">
+                          <a:solidFill>
+                            <a:prstClr val="black"/>
+                          </a:solidFill>
+                        </a:ln>
+                      </wps:spPr>
+                      <wps:txbx>
+                        <w:txbxContent>
+                          <w:p>
+                            <w:r>
+                              <w:t>Deze leerlingenhandleiding</w:t>
+                            </w:r>
+                            <w:r>
+                              <w:t xml:space="preserve"> vind je op</w:t>
+                            </w:r>
+                            <w:r>
+                              <w:t xml:space="preserve">: </w:t>
+                            </w:r>
+                            <w:r>
+                              <w:t>https://github.com/hansdejongehv/Weekendschool-Borduren-Embroidery/blob/main/Handleidingen/Borduren%20-%20leerlingenhandleiding%20v0.2.pdf</w:t>
+                            </w:r>
+                          </w:p>
+                        </w:txbxContent>
+                      </wps:txbx>
+                      <wps:bodyPr rot="0" spcFirstLastPara="0" vertOverflow="overflow" horzOverflow="overflow" vert="horz" wrap="square" lIns="91440" tIns="45720" rIns="91440" bIns="45720" numCol="1" spcCol="0" rtlCol="0" fromWordArt="0" anchor="t" anchorCtr="0" forceAA="0" compatLnSpc="1">
+                        <a:prstTxWarp prst="textNoShape">
+                          <a:avLst/>
+                        </a:prstTxWarp>
+                        <a:noAutofit/>
+                      </wps:bodyPr>
+                    </wps:wsp>
+                  </a:graphicData>
+                </a:graphic>
+                <wp14:sizeRelH relativeFrom="margin">
+                  <wp14:pctWidth>0</wp14:pctWidth>
+                </wp14:sizeRelH>
+                <wp14:sizeRelV relativeFrom="margin">
+                  <wp14:pctHeight>0</wp14:pctHeight>
+                </wp14:sizeRelV>
+              </wp:anchor>
+            </w:drawing>
+          </mc:Choice>
+          <mc:Fallback>
+            <w:pict>
+              <v:shape w14:anchorId="12E3BBDA" id="Text Box 37" o:spid="_x0000_s1062" type="#_x0000_t202" style="position:absolute;margin-left:18.3pt;margin-top:2.7pt;width:368.75pt;height:86.25pt;z-index:251835392;visibility:visible;mso-wrap-style:square;mso-width-percent:0;mso-height-percent:0;mso-wrap-distance-left:9pt;mso-wrap-distance-top:0;mso-wrap-distance-right:9pt;mso-wrap-distance-bottom:0;mso-position-horizontal:absolute;mso-position-horizontal-relative:text;mso-position-vertical:absolute;mso-position-vertical-relative:text;mso-width-percent:0;mso-height-percent:0;mso-width-relative:margin;mso-height-relative:margin;v-text-anchor:top" o:gfxdata="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" fillcolor="white [3201]" strokeweight=".5pt">
+                <v:textbox>
+                  <w:txbxContent>
+                    <w:p>
+                      <w:r>
+                        <w:t>Deze leerlingenhandleiding</w:t>
+                      </w:r>
+                      <w:r>
+                        <w:t xml:space="preserve"> vind je op</w:t>
+                      </w:r>
+                      <w:r>
+                        <w:t xml:space="preserve">: </w:t>
+                      </w:r>
+                      <w:r>
+                        <w:t>https://github.com/hansdejongehv/Weekendschool-Borduren-Embroidery/blob/main/Handleidingen/Borduren%20-%20leerlingenhandleiding%20v0.2.pdf</w:t>
+                      </w:r>
+                    </w:p>
+                  </w:txbxContent>
+                </v:textbox>
+              </v:shape>
+            </w:pict>
+          </mc:Fallback>
+        </mc:AlternateContent>
+      </w:r>
+      <w:r>
+        <w:rPr>
+          <w:noProof/>
+        </w:rPr>
+        <w:drawing>
+          <wp:anchor distT="0" distB="0" distL="114300" distR="114300" simplePos="0" relativeHeight="251828224" behindDoc="0" locked="0" layoutInCell="1" allowOverlap="1" wp14:anchorId="7CBC1404" wp14:editId="40131A8B">
+            <wp:simplePos x="0" y="0"/>
+            <wp:positionH relativeFrom="column">
+              <wp:posOffset>5090160</wp:posOffset>
+            </wp:positionH>
+            <wp:positionV relativeFrom="paragraph">
+              <wp:posOffset>2540</wp:posOffset>
+            </wp:positionV>
+            <wp:extent cx="1138614" cy="1123950"/>
+            <wp:effectExtent l="0" t="0" r="4445" b="0"/>
+            <wp:wrapNone/>
+            <wp:docPr id="100459528" name="Picture 1"/>
+            <wp:cNvGraphicFramePr>
+              <a:graphicFrameLocks xmlns:a="http://schemas.openxmlformats.org/drawingml/2006/main" noChangeAspect="1"/>
+            </wp:cNvGraphicFramePr>
+            <a:graphic xmlns:a="http://schemas.openxmlformats.org/drawingml/2006/main">
+              <a:graphicData uri="http://schemas.openxmlformats.org/drawingml/2006/picture">
+                <pic:pic xmlns:pic="http://schemas.openxmlformats.org/drawingml/2006/picture">
+                  <pic:nvPicPr>
+                    <pic:cNvPr id="100459528" name=""/>
+                    <pic:cNvPicPr/>
+                  </pic:nvPicPr>
                   <pic:blipFill>
-                    <a:blip r:embed="rId45"/>
+                    <a:blip r:embed="rId49" cstate="print">
+                      <a:extLst>
+                        <a:ext uri="{28A0092B-C50C-407E-A947-70E740481C1C}">
+                          <a14:useLocalDpi xmlns:a14="http://schemas.microsoft.com/office/drawing/2010/main" val="0"/>
+                        </a:ext>
+                      </a:extLst>
+                    </a:blip>
                     <a:stretch>
                       <a:fillRect/>
                     </a:stretch>
                   </pic:blipFill>
                   <pic:spPr>
-                    <a:xfrm>
+                    <a:xfrm flipV="1">
                       <a:off x="0" y="0"/>
-                      <a:ext cx="1590897" cy="2695951"/>
+                      <a:ext cx="1138614" cy="1123950"/>
                     </a:xfrm>
                     <a:prstGeom prst="rect">
                       <a:avLst/>
@@ -10575,45 +11031,19 @@
                 </pic:pic>
               </a:graphicData>
             </a:graphic>
-          </wp:inline>
+            <wp14:sizeRelH relativeFrom="page">
+              <wp14:pctWidth>0</wp14:pctWidth>
+            </wp14:sizeRelH>
+            <wp14:sizeRelV relativeFrom="page">
+              <wp14:pctHeight>0</wp14:pctHeight>
+            </wp14:sizeRelV>
+          </wp:anchor>
         </w:drawing>
-      </w:r>
-      <w:r>
-        <w:rPr>
-          <w:noProof/>
-        </w:rPr>
-        <w:t xml:space="preserve"> </w:t>
-      </w:r>
-    </w:p>
-    <w:p>
-      <w:pPr>
-        <w:pStyle w:val="ListParagraph"/>
-        <w:numPr>
-          <w:ilvl w:val="0"/>
-          <w:numId w:val="8"/>
-        </w:numPr>
-      </w:pPr>
-      <w:r>
-        <w:rPr>
-          <w:noProof/>
-        </w:rPr>
-        <w:t>En begin te programmeren</w:t>
-      </w:r>
-      <w:r>
-        <w:rPr>
-          <w:noProof/>
-        </w:rPr>
-        <w:t>!</w:t>
-      </w:r>
-    </w:p>
-    <w:p>
-      <w:r>
-        <w:t xml:space="preserve">Deze opdrachten vind je op </w:t>
       </w:r>
     </w:p>
     <w:p/>
     <w:sectPr>
-      <w:footerReference w:type="default" r:id="rId46"/>
+      <w:footerReference w:type="default" r:id="rId50"/>
       <w:pgSz w:w="16838" w:h="11906" w:orient="landscape"/>
       <w:pgMar w:top="794" w:right="851" w:bottom="1191" w:left="1134" w:header="709" w:footer="709" w:gutter="0"/>
       <w:cols w:space="708"/>

</xml_diff>